<commit_message>
please give me sense
</commit_message>
<xml_diff>
--- a/7 семестр/ИСИС/ЛР 5/ИСИС ЛР 5.docx
+++ b/7 семестр/ИСИС/ЛР 5/ИСИС ЛР 5.docx
@@ -634,25 +634,10 @@
         <w:ind w:hanging="578"/>
       </w:pPr>
       <w:r>
-        <w:t>Установить для всех серверов сети статический режим адресации и задать их адреса в следующем виде: XY.0.0.10 – DHCP-сервер; XY.0.0.100 –</w:t>
-      </w:r>
-      <w:r>
-        <w:t xml:space="preserve"> </w:t>
-      </w:r>
-      <w:r>
-        <w:t xml:space="preserve">DNS-сервер; XY.0.0.100 – HTTP-сервер www.sevgu.ru; </w:t>
-      </w:r>
-      <w:r>
-        <w:lastRenderedPageBreak/>
-        <w:t xml:space="preserve">XY.0.0.200 – HTTP-сервер www.kaf.is. </w:t>
-      </w:r>
-      <w:r>
-        <w:rPr>
-          <w:i/>
-          <w:iCs/>
-          <w:color w:val="FF0000"/>
-        </w:rPr>
-        <w:t>Здесь Х-предпоследняя цифра зачетной книжки, а Y-предпоследняя</w:t>
+        <w:t>Установить для всех серверов сети статический режим адресации и задать их адреса в следующем виде: XY.0.0.10 – DHCP-сервер; XY.0.0.100 – DNS-сервер; XY.0.0.100 – HTTP-сервер www.sevgu.ru; XY.0.0.200 – HTTP-сервер www.kaf.is</w:t>
+      </w:r>
+      <w:r>
+        <w:t>;</w:t>
       </w:r>
     </w:p>
     <w:p>
@@ -665,10 +650,8 @@
         <w:ind w:hanging="578"/>
       </w:pPr>
       <w:r>
-        <w:t>Задать режим динамической адресации для оконечных устройств сети и провести установку и настройку DHCP-сервера на компьютере XY.0.0.10</w:t>
-      </w:r>
-      <w:r>
-        <w:t>;</w:t>
+        <w:lastRenderedPageBreak/>
+        <w:t>Задать режим динамической адресации для оконечных устройств сети и провести установку и настройку DHCP-сервера на компьютере XY.0.0.10;</w:t>
       </w:r>
     </w:p>
     <w:p>
@@ -681,10 +664,7 @@
         <w:ind w:hanging="578"/>
       </w:pPr>
       <w:r>
-        <w:t>Установить на серверный компьютер XY.0.0.100 DNS-сервер и осуществить его настройку</w:t>
-      </w:r>
-      <w:r>
-        <w:t>;</w:t>
+        <w:t>Установить на серверный компьютер XY.0.0.100 DNS-сервер и осуществить его настройку;</w:t>
       </w:r>
     </w:p>
     <w:p>
@@ -725,10 +705,7 @@
         <w:t>ё</w:t>
       </w:r>
       <w:r>
-        <w:t>м страничку сайта www.kaf.is.ru с рекламной информацией о кафедре ИС</w:t>
-      </w:r>
-      <w:r>
-        <w:t>;</w:t>
+        <w:t>м страничку сайта www.kaf.is.ru с рекламной информацией о кафедре ИС;</w:t>
       </w:r>
     </w:p>
     <w:p>
@@ -741,10 +718,7 @@
         <w:ind w:hanging="578"/>
       </w:pPr>
       <w:r>
-        <w:t>Провести проверку связи оконечных устройств друг с другом и доступа к страницам сайтов по их IP-адресам и по доменным символическим именам в реальном режиме и режиме симуляции</w:t>
-      </w:r>
-      <w:r>
-        <w:t>;</w:t>
+        <w:t>Провести проверку связи оконечных устройств друг с другом и доступа к страницам сайтов по их IP-адресам и по доменным символическим именам в реальном режиме и режиме симуляции;</w:t>
       </w:r>
     </w:p>
     <w:p>
@@ -757,22 +731,13 @@
         <w:ind w:hanging="578"/>
       </w:pPr>
       <w:r>
-        <w:t>Исследовать структуру пакетов при обращении к странице одного из сайтов</w:t>
-      </w:r>
-      <w:r>
-        <w:t xml:space="preserve">. </w:t>
-      </w:r>
-      <w:r>
-        <w:t>Оформить отч</w:t>
+        <w:t>Исследовать структуру пакетов при обращении к странице одного из сайтов. Оформить отч</w:t>
       </w:r>
       <w:r>
         <w:t>ё</w:t>
       </w:r>
       <w:r>
-        <w:t>т и сделать выводы по работе</w:t>
-      </w:r>
-      <w:r>
-        <w:t>;</w:t>
+        <w:t>т и сделать выводы по работе;</w:t>
       </w:r>
     </w:p>
     <w:p/>
@@ -792,9 +757,378 @@
     <w:p>
       <w:pPr>
         <w:ind w:firstLine="0"/>
-      </w:pPr>
-    </w:p>
-    <w:p>
+        <w:rPr>
+          <w:lang w:val="en-US"/>
+        </w:rPr>
+      </w:pPr>
+    </w:p>
+    <w:p>
+      <w:r>
+        <w:t xml:space="preserve">После изучения теоретического материала в окне эмулятора </w:t>
+      </w:r>
+      <w:r>
+        <w:rPr>
+          <w:lang w:val="en-US"/>
+        </w:rPr>
+        <w:t>Cisco</w:t>
+      </w:r>
+      <w:r>
+        <w:t xml:space="preserve"> </w:t>
+      </w:r>
+      <w:r>
+        <w:rPr>
+          <w:lang w:val="en-US"/>
+        </w:rPr>
+        <w:t>Packet</w:t>
+      </w:r>
+      <w:r>
+        <w:t xml:space="preserve"> </w:t>
+      </w:r>
+      <w:r>
+        <w:rPr>
+          <w:lang w:val="en-US"/>
+        </w:rPr>
+        <w:t>Tracer</w:t>
+      </w:r>
+      <w:r>
+        <w:t xml:space="preserve"> </w:t>
+      </w:r>
+      <w:r>
+        <w:t xml:space="preserve">была построена схема </w:t>
+      </w:r>
+      <w:r>
+        <w:t xml:space="preserve">исследуемой компьютерной сети (рисунок 3.1). </w:t>
+      </w:r>
+    </w:p>
+    <w:p>
+      <w:pPr>
+        <w:rPr>
+          <w:lang w:val="en-US"/>
+        </w:rPr>
+      </w:pPr>
+      <w:r>
+        <w:t>Центральный коммутатор объединяет группы устройств: серверы (DNS, DHCP, HTTP), компьютеры, ноутбуки, принтер. Есть как физические связи, так и точка беспроводного доступа. Интернет доступен через кабельный модем, подключённый к облаку.</w:t>
+      </w:r>
+    </w:p>
+    <w:p>
+      <w:pPr>
+        <w:rPr>
+          <w:lang w:val="en-US"/>
+        </w:rPr>
+      </w:pPr>
+    </w:p>
+    <w:p>
+      <w:pPr>
+        <w:ind w:firstLine="0"/>
+        <w:jc w:val="center"/>
+      </w:pPr>
+      <w:r>
+        <w:rPr>
+          <w:noProof/>
+        </w:rPr>
+        <w:lastRenderedPageBreak/>
+        <w:drawing>
+          <wp:inline distT="0" distB="0" distL="0" distR="0" wp14:anchorId="2774BA67" wp14:editId="4ADC84BB">
+            <wp:extent cx="4235431" cy="2371090"/>
+            <wp:effectExtent l="0" t="0" r="0" b="0"/>
+            <wp:docPr id="101433626" name="Рисунок 1"/>
+            <wp:cNvGraphicFramePr>
+              <a:graphicFrameLocks xmlns:a="http://schemas.openxmlformats.org/drawingml/2006/main" noChangeAspect="1"/>
+            </wp:cNvGraphicFramePr>
+            <a:graphic xmlns:a="http://schemas.openxmlformats.org/drawingml/2006/main">
+              <a:graphicData uri="http://schemas.openxmlformats.org/drawingml/2006/picture">
+                <pic:pic xmlns:pic="http://schemas.openxmlformats.org/drawingml/2006/picture">
+                  <pic:nvPicPr>
+                    <pic:cNvPr id="101433626" name=""/>
+                    <pic:cNvPicPr/>
+                  </pic:nvPicPr>
+                  <pic:blipFill>
+                    <a:blip r:embed="rId9"/>
+                    <a:stretch>
+                      <a:fillRect/>
+                    </a:stretch>
+                  </pic:blipFill>
+                  <pic:spPr>
+                    <a:xfrm>
+                      <a:off x="0" y="0"/>
+                      <a:ext cx="4240917" cy="2374161"/>
+                    </a:xfrm>
+                    <a:prstGeom prst="rect">
+                      <a:avLst/>
+                    </a:prstGeom>
+                  </pic:spPr>
+                </pic:pic>
+              </a:graphicData>
+            </a:graphic>
+          </wp:inline>
+        </w:drawing>
+      </w:r>
+    </w:p>
+    <w:p>
+      <w:pPr>
+        <w:ind w:firstLine="0"/>
+        <w:jc w:val="center"/>
+      </w:pPr>
+      <w:r>
+        <w:t>Рисунок 3.1 – Схема исследуемой КС</w:t>
+      </w:r>
+    </w:p>
+    <w:p>
+      <w:pPr>
+        <w:ind w:firstLine="0"/>
+      </w:pPr>
+    </w:p>
+    <w:p>
+      <w:r>
+        <w:t xml:space="preserve">Сначала </w:t>
+      </w:r>
+      <w:r>
+        <w:t xml:space="preserve">для </w:t>
+      </w:r>
+      <w:r>
+        <w:t>серверов сети была задана статическая адресация:</w:t>
+      </w:r>
+    </w:p>
+    <w:p>
+      <w:pPr>
+        <w:pStyle w:val="aa"/>
+        <w:numPr>
+          <w:ilvl w:val="0"/>
+          <w:numId w:val="38"/>
+        </w:numPr>
+        <w:rPr>
+          <w:lang w:val="en-US"/>
+        </w:rPr>
+      </w:pPr>
+      <w:r>
+        <w:rPr>
+          <w:lang w:val="en-US"/>
+        </w:rPr>
+        <w:t>DNS</w:t>
+      </w:r>
+      <w:r>
+        <w:rPr>
+          <w:lang w:val="en-US"/>
+        </w:rPr>
+        <w:t xml:space="preserve"> / </w:t>
+      </w:r>
+      <w:r>
+        <w:rPr>
+          <w:lang w:val="en-US"/>
+        </w:rPr>
+        <w:t>HTTP (www.sevgu.ru)</w:t>
+      </w:r>
+      <w:r>
+        <w:rPr>
+          <w:lang w:val="en-US"/>
+        </w:rPr>
+        <w:t>: 1.0.0.100</w:t>
+      </w:r>
+    </w:p>
+    <w:p>
+      <w:pPr>
+        <w:pStyle w:val="aa"/>
+        <w:numPr>
+          <w:ilvl w:val="0"/>
+          <w:numId w:val="38"/>
+        </w:numPr>
+      </w:pPr>
+      <w:r>
+        <w:t>DHCP: 1.0.0.10</w:t>
+      </w:r>
+    </w:p>
+    <w:p>
+      <w:pPr>
+        <w:pStyle w:val="aa"/>
+        <w:numPr>
+          <w:ilvl w:val="0"/>
+          <w:numId w:val="38"/>
+        </w:numPr>
+      </w:pPr>
+      <w:r>
+        <w:t>HTTP (www.kaf.is):</w:t>
+      </w:r>
+      <w:r>
+        <w:t xml:space="preserve"> </w:t>
+      </w:r>
+      <w:r>
+        <w:t>1.0.0.</w:t>
+      </w:r>
+      <w:r>
+        <w:t>2</w:t>
+      </w:r>
+      <w:r>
+        <w:t>00</w:t>
+      </w:r>
+    </w:p>
+    <w:p>
+      <w:r>
+        <w:t>Чтобы пакеты могли передаваться через облако</w:t>
+      </w:r>
+      <w:r>
+        <w:t xml:space="preserve"> </w:t>
+      </w:r>
+      <w:r>
+        <w:t xml:space="preserve">на модеме </w:t>
+      </w:r>
+      <w:r>
+        <w:t xml:space="preserve">были </w:t>
+      </w:r>
+      <w:r>
+        <w:t xml:space="preserve">установлены модули для коаксиального (выход) и </w:t>
+      </w:r>
+      <w:r>
+        <w:rPr>
+          <w:lang w:val="en-US"/>
+        </w:rPr>
+        <w:t>Ethernet</w:t>
+      </w:r>
+      <w:r>
+        <w:t>-</w:t>
+      </w:r>
+      <w:r>
+        <w:t>подключений (вход), после чего были связаны соответствующие порты (рисунок 3.2).</w:t>
+      </w:r>
+    </w:p>
+    <w:p/>
+    <w:p>
+      <w:pPr>
+        <w:ind w:firstLine="0"/>
+        <w:jc w:val="center"/>
+        <w:rPr>
+          <w:lang w:val="en-US"/>
+        </w:rPr>
+      </w:pPr>
+      <w:r>
+        <w:rPr>
+          <w:noProof/>
+        </w:rPr>
+        <w:drawing>
+          <wp:inline distT="0" distB="0" distL="0" distR="0" wp14:anchorId="71215886" wp14:editId="5A314B0B">
+            <wp:extent cx="5092437" cy="787400"/>
+            <wp:effectExtent l="0" t="0" r="0" b="0"/>
+            <wp:docPr id="1127927308" name="Рисунок 1"/>
+            <wp:cNvGraphicFramePr>
+              <a:graphicFrameLocks xmlns:a="http://schemas.openxmlformats.org/drawingml/2006/main" noChangeAspect="1"/>
+            </wp:cNvGraphicFramePr>
+            <a:graphic xmlns:a="http://schemas.openxmlformats.org/drawingml/2006/main">
+              <a:graphicData uri="http://schemas.openxmlformats.org/drawingml/2006/picture">
+                <pic:pic xmlns:pic="http://schemas.openxmlformats.org/drawingml/2006/picture">
+                  <pic:nvPicPr>
+                    <pic:cNvPr id="1127927308" name=""/>
+                    <pic:cNvPicPr/>
+                  </pic:nvPicPr>
+                  <pic:blipFill>
+                    <a:blip r:embed="rId10"/>
+                    <a:stretch>
+                      <a:fillRect/>
+                    </a:stretch>
+                  </pic:blipFill>
+                  <pic:spPr>
+                    <a:xfrm>
+                      <a:off x="0" y="0"/>
+                      <a:ext cx="5150949" cy="796447"/>
+                    </a:xfrm>
+                    <a:prstGeom prst="rect">
+                      <a:avLst/>
+                    </a:prstGeom>
+                  </pic:spPr>
+                </pic:pic>
+              </a:graphicData>
+            </a:graphic>
+          </wp:inline>
+        </w:drawing>
+      </w:r>
+    </w:p>
+    <w:p>
+      <w:pPr>
+        <w:ind w:firstLine="0"/>
+        <w:jc w:val="center"/>
+      </w:pPr>
+      <w:r>
+        <w:t>Рисунок 3.</w:t>
+      </w:r>
+      <w:r>
+        <w:t xml:space="preserve"> </w:t>
+      </w:r>
+      <w:r>
+        <w:t>2 – Связь ЛКС с облаком через модем</w:t>
+      </w:r>
+    </w:p>
+    <w:p>
+      <w:pPr>
+        <w:ind w:firstLine="0"/>
+      </w:pPr>
+    </w:p>
+    <w:p>
+      <w:r>
+        <w:t xml:space="preserve">Далее был выделен сервер для протокола </w:t>
+      </w:r>
+      <w:r>
+        <w:rPr>
+          <w:lang w:val="en-US"/>
+        </w:rPr>
+        <w:t>DHCP</w:t>
+      </w:r>
+      <w:r>
+        <w:t xml:space="preserve"> (</w:t>
+      </w:r>
+      <w:r>
+        <w:t>служб</w:t>
+      </w:r>
+      <w:r>
+        <w:t>а</w:t>
+      </w:r>
+      <w:r>
+        <w:t xml:space="preserve"> поддержки протокола TCP/IP</w:t>
+      </w:r>
+      <w:r>
+        <w:t xml:space="preserve">). Для этого на сервере была установлена служба </w:t>
+      </w:r>
+      <w:r>
+        <w:rPr>
+          <w:lang w:val="en-US"/>
+        </w:rPr>
+        <w:t>DHCP</w:t>
+      </w:r>
+      <w:r>
+        <w:t xml:space="preserve">, в ней </w:t>
+      </w:r>
+      <w:r>
+        <w:t>задан</w:t>
+      </w:r>
+      <w:r>
+        <w:t xml:space="preserve"> </w:t>
+      </w:r>
+      <w:r>
+        <w:t xml:space="preserve">пул </w:t>
+      </w:r>
+      <w:r>
+        <w:rPr>
+          <w:lang w:val="en-US"/>
+        </w:rPr>
+        <w:t>IP</w:t>
+      </w:r>
+      <w:r>
+        <w:t>-</w:t>
+      </w:r>
+      <w:r>
+        <w:t xml:space="preserve">адресов </w:t>
+      </w:r>
+      <w:r>
+        <w:t>(</w:t>
+      </w:r>
+      <w:r>
+        <w:t>рисунок 3.3).</w:t>
+      </w:r>
+      <w:r>
+        <w:t xml:space="preserve"> </w:t>
+      </w:r>
+    </w:p>
+    <w:p>
+      <w:r>
+        <w:t>Благодаря этой службе для оконечных устройств сети можно было задать динамическую адресацию</w:t>
+      </w:r>
       <w:r>
         <w:t>.</w:t>
       </w:r>
@@ -804,7 +1138,1167 @@
         <w:ind w:firstLine="0"/>
       </w:pPr>
     </w:p>
+    <w:p>
+      <w:pPr>
+        <w:ind w:firstLine="0"/>
+        <w:jc w:val="center"/>
+        <w:rPr>
+          <w:lang w:val="en-US"/>
+        </w:rPr>
+      </w:pPr>
+      <w:r>
+        <w:rPr>
+          <w:noProof/>
+        </w:rPr>
+        <w:lastRenderedPageBreak/>
+        <w:drawing>
+          <wp:inline distT="0" distB="0" distL="0" distR="0" wp14:anchorId="7C106E88" wp14:editId="74A93DD4">
+            <wp:extent cx="4817818" cy="2419350"/>
+            <wp:effectExtent l="0" t="0" r="0" b="0"/>
+            <wp:docPr id="220904506" name="Рисунок 1"/>
+            <wp:cNvGraphicFramePr>
+              <a:graphicFrameLocks xmlns:a="http://schemas.openxmlformats.org/drawingml/2006/main" noChangeAspect="1"/>
+            </wp:cNvGraphicFramePr>
+            <a:graphic xmlns:a="http://schemas.openxmlformats.org/drawingml/2006/main">
+              <a:graphicData uri="http://schemas.openxmlformats.org/drawingml/2006/picture">
+                <pic:pic xmlns:pic="http://schemas.openxmlformats.org/drawingml/2006/picture">
+                  <pic:nvPicPr>
+                    <pic:cNvPr id="220904506" name=""/>
+                    <pic:cNvPicPr/>
+                  </pic:nvPicPr>
+                  <pic:blipFill>
+                    <a:blip r:embed="rId11"/>
+                    <a:stretch>
+                      <a:fillRect/>
+                    </a:stretch>
+                  </pic:blipFill>
+                  <pic:spPr>
+                    <a:xfrm>
+                      <a:off x="0" y="0"/>
+                      <a:ext cx="4827241" cy="2424082"/>
+                    </a:xfrm>
+                    <a:prstGeom prst="rect">
+                      <a:avLst/>
+                    </a:prstGeom>
+                  </pic:spPr>
+                </pic:pic>
+              </a:graphicData>
+            </a:graphic>
+          </wp:inline>
+        </w:drawing>
+      </w:r>
+    </w:p>
+    <w:p>
+      <w:pPr>
+        <w:ind w:firstLine="0"/>
+        <w:jc w:val="center"/>
+      </w:pPr>
+      <w:r>
+        <w:t xml:space="preserve">Рисунок 3.3 </w:t>
+      </w:r>
+      <w:r>
+        <w:sym w:font="Symbol" w:char="F02D"/>
+      </w:r>
+      <w:r>
+        <w:t xml:space="preserve"> </w:t>
+      </w:r>
+      <w:r>
+        <w:t>Конфигурация DHCP-сервера</w:t>
+      </w:r>
+    </w:p>
+    <w:p>
+      <w:pPr>
+        <w:ind w:firstLine="0"/>
+      </w:pPr>
+    </w:p>
+    <w:p>
+      <w:r>
+        <w:t xml:space="preserve">На другом сервере была установлена и настроена служба </w:t>
+      </w:r>
+      <w:r>
+        <w:rPr>
+          <w:lang w:val="en-US"/>
+        </w:rPr>
+        <w:t>DNS</w:t>
+      </w:r>
+      <w:r>
+        <w:t xml:space="preserve">. </w:t>
+      </w:r>
+      <w:r>
+        <w:t xml:space="preserve">Указанные в задании доменные имена были связаны с </w:t>
+      </w:r>
+      <w:r>
+        <w:t xml:space="preserve">именами сайтов и </w:t>
+      </w:r>
+      <w:r>
+        <w:rPr>
+          <w:lang w:val="en-US"/>
+        </w:rPr>
+        <w:t>IP</w:t>
+      </w:r>
+      <w:r>
+        <w:t>-</w:t>
+      </w:r>
+      <w:r>
+        <w:t>адресами соответствующих им компьютеров сети (рисунок 3.4).</w:t>
+      </w:r>
+    </w:p>
     <w:p/>
+    <w:p>
+      <w:pPr>
+        <w:ind w:firstLine="0"/>
+        <w:jc w:val="center"/>
+      </w:pPr>
+      <w:r>
+        <w:rPr>
+          <w:noProof/>
+        </w:rPr>
+        <w:drawing>
+          <wp:inline distT="0" distB="0" distL="0" distR="0" wp14:anchorId="74A0D675" wp14:editId="1935075F">
+            <wp:extent cx="5105306" cy="2298700"/>
+            <wp:effectExtent l="0" t="0" r="0" b="0"/>
+            <wp:docPr id="2138231367" name="Рисунок 1"/>
+            <wp:cNvGraphicFramePr>
+              <a:graphicFrameLocks xmlns:a="http://schemas.openxmlformats.org/drawingml/2006/main" noChangeAspect="1"/>
+            </wp:cNvGraphicFramePr>
+            <a:graphic xmlns:a="http://schemas.openxmlformats.org/drawingml/2006/main">
+              <a:graphicData uri="http://schemas.openxmlformats.org/drawingml/2006/picture">
+                <pic:pic xmlns:pic="http://schemas.openxmlformats.org/drawingml/2006/picture">
+                  <pic:nvPicPr>
+                    <pic:cNvPr id="2138231367" name=""/>
+                    <pic:cNvPicPr/>
+                  </pic:nvPicPr>
+                  <pic:blipFill>
+                    <a:blip r:embed="rId12"/>
+                    <a:stretch>
+                      <a:fillRect/>
+                    </a:stretch>
+                  </pic:blipFill>
+                  <pic:spPr>
+                    <a:xfrm>
+                      <a:off x="0" y="0"/>
+                      <a:ext cx="5112212" cy="2301809"/>
+                    </a:xfrm>
+                    <a:prstGeom prst="rect">
+                      <a:avLst/>
+                    </a:prstGeom>
+                  </pic:spPr>
+                </pic:pic>
+              </a:graphicData>
+            </a:graphic>
+          </wp:inline>
+        </w:drawing>
+      </w:r>
+    </w:p>
+    <w:p>
+      <w:pPr>
+        <w:ind w:firstLine="0"/>
+        <w:jc w:val="center"/>
+      </w:pPr>
+      <w:r>
+        <w:t xml:space="preserve">Рисунок 3.4 </w:t>
+      </w:r>
+      <w:r>
+        <w:sym w:font="Symbol" w:char="F02D"/>
+      </w:r>
+      <w:r>
+        <w:t xml:space="preserve"> </w:t>
+      </w:r>
+      <w:r>
+        <w:t>Конфигурация DNS-сервера</w:t>
+      </w:r>
+    </w:p>
+    <w:p/>
+    <w:p>
+      <w:r>
+        <w:t xml:space="preserve">На серверах с соответствующими </w:t>
+      </w:r>
+      <w:r>
+        <w:rPr>
+          <w:lang w:val="en-US"/>
+        </w:rPr>
+        <w:t>IP</w:t>
+      </w:r>
+      <w:r>
+        <w:t xml:space="preserve"> </w:t>
+      </w:r>
+      <w:r>
+        <w:t>б</w:t>
+      </w:r>
+      <w:r>
+        <w:t>ыл</w:t>
+      </w:r>
+      <w:r>
+        <w:t>и</w:t>
+      </w:r>
+      <w:r>
+        <w:t xml:space="preserve"> </w:t>
+      </w:r>
+      <w:r>
+        <w:t>запущены</w:t>
+      </w:r>
+      <w:r>
+        <w:t xml:space="preserve"> </w:t>
+      </w:r>
+      <w:r>
+        <w:rPr>
+          <w:lang w:val="en-US"/>
+        </w:rPr>
+        <w:t>HTTP</w:t>
+      </w:r>
+      <w:r>
+        <w:t>-</w:t>
+      </w:r>
+      <w:r>
+        <w:t xml:space="preserve">службы для </w:t>
+      </w:r>
+      <w:r>
+        <w:rPr>
+          <w:i/>
+          <w:iCs/>
+          <w:lang w:val="en-US"/>
+        </w:rPr>
+        <w:t>kaf</w:t>
+      </w:r>
+      <w:r>
+        <w:rPr>
+          <w:i/>
+          <w:iCs/>
+        </w:rPr>
+        <w:t>.</w:t>
+      </w:r>
+      <w:r>
+        <w:rPr>
+          <w:i/>
+          <w:iCs/>
+          <w:lang w:val="en-US"/>
+        </w:rPr>
+        <w:t>is</w:t>
+      </w:r>
+      <w:r>
+        <w:t xml:space="preserve"> </w:t>
+      </w:r>
+      <w:r>
+        <w:t xml:space="preserve">и </w:t>
+      </w:r>
+      <w:r>
+        <w:rPr>
+          <w:i/>
+          <w:iCs/>
+          <w:lang w:val="en-US"/>
+        </w:rPr>
+        <w:t>sevsu</w:t>
+      </w:r>
+      <w:r>
+        <w:rPr>
+          <w:i/>
+          <w:iCs/>
+        </w:rPr>
+        <w:t>.</w:t>
+      </w:r>
+      <w:r>
+        <w:rPr>
+          <w:i/>
+          <w:iCs/>
+          <w:lang w:val="en-US"/>
+        </w:rPr>
+        <w:t>ru</w:t>
+      </w:r>
+      <w:r>
+        <w:t xml:space="preserve">. </w:t>
+      </w:r>
+      <w:r>
+        <w:t>Для каждого сайта ш</w:t>
+      </w:r>
+      <w:r>
+        <w:t xml:space="preserve">аблон </w:t>
+      </w:r>
+      <w:r>
+        <w:t xml:space="preserve">заглавной страницы </w:t>
+      </w:r>
+      <w:r>
+        <w:rPr>
+          <w:lang w:val="en-US"/>
+        </w:rPr>
+        <w:t>index</w:t>
+      </w:r>
+      <w:r>
+        <w:t>.</w:t>
+      </w:r>
+      <w:r>
+        <w:rPr>
+          <w:lang w:val="en-US"/>
+        </w:rPr>
+        <w:t>html</w:t>
+      </w:r>
+      <w:r>
+        <w:t xml:space="preserve"> </w:t>
+      </w:r>
+      <w:r>
+        <w:t>был заполнен приветственным текстом (рисун</w:t>
+      </w:r>
+      <w:r>
+        <w:t>ки</w:t>
+      </w:r>
+      <w:r>
+        <w:t xml:space="preserve"> 3.5</w:t>
+      </w:r>
+      <w:r>
+        <w:t>-3.6</w:t>
+      </w:r>
+      <w:r>
+        <w:t>).</w:t>
+      </w:r>
+    </w:p>
+    <w:p>
+      <w:pPr>
+        <w:rPr>
+          <w:lang w:val="en-US"/>
+        </w:rPr>
+      </w:pPr>
+    </w:p>
+    <w:p>
+      <w:pPr>
+        <w:ind w:firstLine="0"/>
+        <w:jc w:val="center"/>
+      </w:pPr>
+      <w:r>
+        <w:rPr>
+          <w:noProof/>
+        </w:rPr>
+        <w:lastRenderedPageBreak/>
+        <w:drawing>
+          <wp:inline distT="0" distB="0" distL="0" distR="0" wp14:anchorId="734B9FA0" wp14:editId="139A62C2">
+            <wp:extent cx="5168900" cy="2131435"/>
+            <wp:effectExtent l="0" t="0" r="0" b="0"/>
+            <wp:docPr id="137437085" name="Рисунок 1"/>
+            <wp:cNvGraphicFramePr>
+              <a:graphicFrameLocks xmlns:a="http://schemas.openxmlformats.org/drawingml/2006/main" noChangeAspect="1"/>
+            </wp:cNvGraphicFramePr>
+            <a:graphic xmlns:a="http://schemas.openxmlformats.org/drawingml/2006/main">
+              <a:graphicData uri="http://schemas.openxmlformats.org/drawingml/2006/picture">
+                <pic:pic xmlns:pic="http://schemas.openxmlformats.org/drawingml/2006/picture">
+                  <pic:nvPicPr>
+                    <pic:cNvPr id="137437085" name=""/>
+                    <pic:cNvPicPr/>
+                  </pic:nvPicPr>
+                  <pic:blipFill>
+                    <a:blip r:embed="rId13"/>
+                    <a:stretch>
+                      <a:fillRect/>
+                    </a:stretch>
+                  </pic:blipFill>
+                  <pic:spPr>
+                    <a:xfrm>
+                      <a:off x="0" y="0"/>
+                      <a:ext cx="5183613" cy="2137502"/>
+                    </a:xfrm>
+                    <a:prstGeom prst="rect">
+                      <a:avLst/>
+                    </a:prstGeom>
+                  </pic:spPr>
+                </pic:pic>
+              </a:graphicData>
+            </a:graphic>
+          </wp:inline>
+        </w:drawing>
+      </w:r>
+    </w:p>
+    <w:p>
+      <w:pPr>
+        <w:ind w:firstLine="0"/>
+        <w:jc w:val="center"/>
+      </w:pPr>
+      <w:r>
+        <w:t xml:space="preserve">Рисунок 3.5 </w:t>
+      </w:r>
+      <w:r>
+        <w:sym w:font="Symbol" w:char="F02D"/>
+      </w:r>
+      <w:r>
+        <w:t xml:space="preserve"> </w:t>
+      </w:r>
+      <w:r>
+        <w:t>Конфигурация HTTP-сервера</w:t>
+      </w:r>
+      <w:r>
+        <w:t xml:space="preserve"> для </w:t>
+      </w:r>
+      <w:r>
+        <w:rPr>
+          <w:lang w:val="en-US"/>
+        </w:rPr>
+        <w:t>sevsu</w:t>
+      </w:r>
+      <w:r>
+        <w:t>.</w:t>
+      </w:r>
+      <w:r>
+        <w:rPr>
+          <w:lang w:val="en-US"/>
+        </w:rPr>
+        <w:t>ru</w:t>
+      </w:r>
+    </w:p>
+    <w:p>
+      <w:pPr>
+        <w:ind w:firstLine="0"/>
+        <w:jc w:val="center"/>
+      </w:pPr>
+    </w:p>
+    <w:p>
+      <w:pPr>
+        <w:ind w:firstLine="0"/>
+        <w:jc w:val="center"/>
+      </w:pPr>
+      <w:r>
+        <w:drawing>
+          <wp:inline distT="0" distB="0" distL="0" distR="0" wp14:anchorId="2EC49459" wp14:editId="2512EE6D">
+            <wp:extent cx="5092700" cy="2016342"/>
+            <wp:effectExtent l="0" t="0" r="0" b="0"/>
+            <wp:docPr id="2142039329" name="Рисунок 1"/>
+            <wp:cNvGraphicFramePr>
+              <a:graphicFrameLocks xmlns:a="http://schemas.openxmlformats.org/drawingml/2006/main" noChangeAspect="1"/>
+            </wp:cNvGraphicFramePr>
+            <a:graphic xmlns:a="http://schemas.openxmlformats.org/drawingml/2006/main">
+              <a:graphicData uri="http://schemas.openxmlformats.org/drawingml/2006/picture">
+                <pic:pic xmlns:pic="http://schemas.openxmlformats.org/drawingml/2006/picture">
+                  <pic:nvPicPr>
+                    <pic:cNvPr id="2142039329" name=""/>
+                    <pic:cNvPicPr/>
+                  </pic:nvPicPr>
+                  <pic:blipFill>
+                    <a:blip r:embed="rId14"/>
+                    <a:stretch>
+                      <a:fillRect/>
+                    </a:stretch>
+                  </pic:blipFill>
+                  <pic:spPr>
+                    <a:xfrm>
+                      <a:off x="0" y="0"/>
+                      <a:ext cx="5097754" cy="2018343"/>
+                    </a:xfrm>
+                    <a:prstGeom prst="rect">
+                      <a:avLst/>
+                    </a:prstGeom>
+                  </pic:spPr>
+                </pic:pic>
+              </a:graphicData>
+            </a:graphic>
+          </wp:inline>
+        </w:drawing>
+      </w:r>
+    </w:p>
+    <w:p>
+      <w:pPr>
+        <w:ind w:firstLine="0"/>
+        <w:jc w:val="center"/>
+      </w:pPr>
+      <w:r>
+        <w:t>Рисунок 3.</w:t>
+      </w:r>
+      <w:r>
+        <w:t>6</w:t>
+      </w:r>
+      <w:r>
+        <w:t xml:space="preserve"> </w:t>
+      </w:r>
+      <w:r>
+        <w:sym w:font="Symbol" w:char="F02D"/>
+      </w:r>
+      <w:r>
+        <w:t xml:space="preserve"> </w:t>
+      </w:r>
+      <w:r>
+        <w:t>Конфигурация HTTP-сервера</w:t>
+      </w:r>
+      <w:r>
+        <w:t xml:space="preserve"> для </w:t>
+      </w:r>
+      <w:r>
+        <w:rPr>
+          <w:lang w:val="en-US"/>
+        </w:rPr>
+        <w:t>kaf</w:t>
+      </w:r>
+      <w:r>
+        <w:t>.</w:t>
+      </w:r>
+      <w:r>
+        <w:rPr>
+          <w:lang w:val="en-US"/>
+        </w:rPr>
+        <w:t>is</w:t>
+      </w:r>
+    </w:p>
+    <w:p>
+      <w:pPr>
+        <w:ind w:firstLine="0"/>
+        <w:jc w:val="center"/>
+      </w:pPr>
+    </w:p>
+    <w:p>
+      <w:r>
+        <w:t>После всех настроек была проверена функциональность полученной сети. Во</w:t>
+      </w:r>
+      <w:r>
+        <w:t>-</w:t>
+      </w:r>
+      <w:r>
+        <w:t xml:space="preserve">первых, было проверено, что рабочие станции автоматически получили настройки адресации по </w:t>
+      </w:r>
+      <w:r>
+        <w:rPr>
+          <w:lang w:val="en-US"/>
+        </w:rPr>
+        <w:t>DHCP</w:t>
+      </w:r>
+      <w:r>
+        <w:t>-</w:t>
+      </w:r>
+      <w:r>
+        <w:t>протоколу (рисунок 3.</w:t>
+      </w:r>
+      <w:r>
+        <w:t>7</w:t>
+      </w:r>
+      <w:r>
+        <w:t>).</w:t>
+      </w:r>
+    </w:p>
+    <w:p/>
+    <w:p>
+      <w:pPr>
+        <w:ind w:firstLine="0"/>
+        <w:jc w:val="center"/>
+      </w:pPr>
+      <w:r>
+        <w:rPr>
+          <w:noProof/>
+        </w:rPr>
+        <w:drawing>
+          <wp:inline distT="0" distB="0" distL="0" distR="0" wp14:anchorId="607C6F58" wp14:editId="2CE5F0D7">
+            <wp:extent cx="3280638" cy="1746250"/>
+            <wp:effectExtent l="0" t="0" r="0" b="0"/>
+            <wp:docPr id="1614251455" name="Рисунок 1"/>
+            <wp:cNvGraphicFramePr>
+              <a:graphicFrameLocks xmlns:a="http://schemas.openxmlformats.org/drawingml/2006/main" noChangeAspect="1"/>
+            </wp:cNvGraphicFramePr>
+            <a:graphic xmlns:a="http://schemas.openxmlformats.org/drawingml/2006/main">
+              <a:graphicData uri="http://schemas.openxmlformats.org/drawingml/2006/picture">
+                <pic:pic xmlns:pic="http://schemas.openxmlformats.org/drawingml/2006/picture">
+                  <pic:nvPicPr>
+                    <pic:cNvPr id="1614251455" name=""/>
+                    <pic:cNvPicPr/>
+                  </pic:nvPicPr>
+                  <pic:blipFill>
+                    <a:blip r:embed="rId15"/>
+                    <a:stretch>
+                      <a:fillRect/>
+                    </a:stretch>
+                  </pic:blipFill>
+                  <pic:spPr>
+                    <a:xfrm>
+                      <a:off x="0" y="0"/>
+                      <a:ext cx="3286491" cy="1749366"/>
+                    </a:xfrm>
+                    <a:prstGeom prst="rect">
+                      <a:avLst/>
+                    </a:prstGeom>
+                  </pic:spPr>
+                </pic:pic>
+              </a:graphicData>
+            </a:graphic>
+          </wp:inline>
+        </w:drawing>
+      </w:r>
+    </w:p>
+    <w:p>
+      <w:pPr>
+        <w:ind w:firstLine="0"/>
+        <w:jc w:val="center"/>
+      </w:pPr>
+      <w:r>
+        <w:t>Рисунок 3.</w:t>
+      </w:r>
+      <w:r>
+        <w:t xml:space="preserve">7 </w:t>
+      </w:r>
+      <w:r>
+        <w:t xml:space="preserve">– Получение конфигурационных данных на </w:t>
+      </w:r>
+      <w:r>
+        <w:rPr>
+          <w:lang w:val="en-US"/>
+        </w:rPr>
+        <w:t>PC</w:t>
+      </w:r>
+      <w:r>
+        <w:t>1</w:t>
+      </w:r>
+    </w:p>
+    <w:p/>
+    <w:p>
+      <w:r>
+        <w:lastRenderedPageBreak/>
+        <w:t>Также была проверена беспроводная связь устройств через пингование (рисунок 3.</w:t>
+      </w:r>
+      <w:r>
+        <w:t>8</w:t>
+      </w:r>
+      <w:r>
+        <w:t xml:space="preserve">). </w:t>
+      </w:r>
+    </w:p>
+    <w:p/>
+    <w:p>
+      <w:pPr>
+        <w:ind w:firstLine="0"/>
+        <w:jc w:val="center"/>
+      </w:pPr>
+      <w:r>
+        <w:drawing>
+          <wp:inline distT="0" distB="0" distL="0" distR="0" wp14:anchorId="6388C540" wp14:editId="79D82B38">
+            <wp:extent cx="3547229" cy="1619250"/>
+            <wp:effectExtent l="0" t="0" r="0" b="0"/>
+            <wp:docPr id="1249084981" name="Рисунок 1"/>
+            <wp:cNvGraphicFramePr>
+              <a:graphicFrameLocks xmlns:a="http://schemas.openxmlformats.org/drawingml/2006/main" noChangeAspect="1"/>
+            </wp:cNvGraphicFramePr>
+            <a:graphic xmlns:a="http://schemas.openxmlformats.org/drawingml/2006/main">
+              <a:graphicData uri="http://schemas.openxmlformats.org/drawingml/2006/picture">
+                <pic:pic xmlns:pic="http://schemas.openxmlformats.org/drawingml/2006/picture">
+                  <pic:nvPicPr>
+                    <pic:cNvPr id="1249084981" name=""/>
+                    <pic:cNvPicPr/>
+                  </pic:nvPicPr>
+                  <pic:blipFill>
+                    <a:blip r:embed="rId16"/>
+                    <a:stretch>
+                      <a:fillRect/>
+                    </a:stretch>
+                  </pic:blipFill>
+                  <pic:spPr>
+                    <a:xfrm>
+                      <a:off x="0" y="0"/>
+                      <a:ext cx="3567781" cy="1628631"/>
+                    </a:xfrm>
+                    <a:prstGeom prst="rect">
+                      <a:avLst/>
+                    </a:prstGeom>
+                  </pic:spPr>
+                </pic:pic>
+              </a:graphicData>
+            </a:graphic>
+          </wp:inline>
+        </w:drawing>
+      </w:r>
+    </w:p>
+    <w:p>
+      <w:pPr>
+        <w:ind w:firstLine="0"/>
+        <w:jc w:val="center"/>
+      </w:pPr>
+      <w:r>
+        <w:t>Рисунок 3.</w:t>
+      </w:r>
+      <w:r>
+        <w:t>8</w:t>
+      </w:r>
+      <w:r>
+        <w:t xml:space="preserve"> – Пинг с </w:t>
+      </w:r>
+      <w:r>
+        <w:rPr>
+          <w:lang w:val="en-US"/>
+        </w:rPr>
+        <w:t>PC</w:t>
+      </w:r>
+      <w:r>
+        <w:t xml:space="preserve">1 </w:t>
+      </w:r>
+      <w:r>
+        <w:t xml:space="preserve">на </w:t>
+      </w:r>
+      <w:r>
+        <w:rPr>
+          <w:lang w:val="en-US"/>
+        </w:rPr>
+        <w:t>Laptop</w:t>
+      </w:r>
+      <w:r>
+        <w:t>1</w:t>
+      </w:r>
+    </w:p>
+    <w:p>
+      <w:pPr>
+        <w:ind w:firstLine="0"/>
+        <w:jc w:val="center"/>
+      </w:pPr>
+    </w:p>
+    <w:p>
+      <w:r>
+        <w:t>Помимо этого</w:t>
+      </w:r>
+      <w:r>
+        <w:t>,</w:t>
+      </w:r>
+      <w:r>
+        <w:t xml:space="preserve"> </w:t>
+      </w:r>
+      <w:r>
+        <w:t>был выполнен пинг на имя сервера. Оба настроенн</w:t>
+      </w:r>
+      <w:r>
+        <w:t xml:space="preserve">ых сервера </w:t>
+      </w:r>
+      <w:r>
+        <w:t>успешно ответили на запрос (рисунок 3.</w:t>
+      </w:r>
+      <w:r>
+        <w:t>9</w:t>
+      </w:r>
+      <w:r>
+        <w:t>).</w:t>
+      </w:r>
+    </w:p>
+    <w:p/>
+    <w:p>
+      <w:pPr>
+        <w:ind w:firstLine="0"/>
+        <w:jc w:val="center"/>
+      </w:pPr>
+      <w:r>
+        <w:drawing>
+          <wp:inline distT="0" distB="0" distL="0" distR="0" wp14:anchorId="0C454B13" wp14:editId="5AB88794">
+            <wp:extent cx="3594100" cy="3302000"/>
+            <wp:effectExtent l="0" t="0" r="0" b="0"/>
+            <wp:docPr id="2056598551" name="Рисунок 1"/>
+            <wp:cNvGraphicFramePr>
+              <a:graphicFrameLocks xmlns:a="http://schemas.openxmlformats.org/drawingml/2006/main" noChangeAspect="1"/>
+            </wp:cNvGraphicFramePr>
+            <a:graphic xmlns:a="http://schemas.openxmlformats.org/drawingml/2006/main">
+              <a:graphicData uri="http://schemas.openxmlformats.org/drawingml/2006/picture">
+                <pic:pic xmlns:pic="http://schemas.openxmlformats.org/drawingml/2006/picture">
+                  <pic:nvPicPr>
+                    <pic:cNvPr id="2056598551" name=""/>
+                    <pic:cNvPicPr/>
+                  </pic:nvPicPr>
+                  <pic:blipFill>
+                    <a:blip r:embed="rId17"/>
+                    <a:stretch>
+                      <a:fillRect/>
+                    </a:stretch>
+                  </pic:blipFill>
+                  <pic:spPr>
+                    <a:xfrm>
+                      <a:off x="0" y="0"/>
+                      <a:ext cx="3596123" cy="3303859"/>
+                    </a:xfrm>
+                    <a:prstGeom prst="rect">
+                      <a:avLst/>
+                    </a:prstGeom>
+                  </pic:spPr>
+                </pic:pic>
+              </a:graphicData>
+            </a:graphic>
+          </wp:inline>
+        </w:drawing>
+      </w:r>
+    </w:p>
+    <w:p>
+      <w:pPr>
+        <w:ind w:firstLine="0"/>
+        <w:jc w:val="center"/>
+      </w:pPr>
+      <w:r>
+        <w:t>Рисунок 3.</w:t>
+      </w:r>
+      <w:r>
+        <w:t xml:space="preserve">9 </w:t>
+      </w:r>
+      <w:r>
+        <w:t xml:space="preserve">– Пинг с </w:t>
+      </w:r>
+      <w:r>
+        <w:rPr>
+          <w:lang w:val="en-US"/>
+        </w:rPr>
+        <w:t>PC</w:t>
+      </w:r>
+      <w:r>
+        <w:t xml:space="preserve">1 </w:t>
+      </w:r>
+      <w:r>
+        <w:t>на имена серверов</w:t>
+      </w:r>
+    </w:p>
+    <w:p/>
+    <w:p>
+      <w:r>
+        <w:t xml:space="preserve">Для проверки </w:t>
+      </w:r>
+      <w:r>
+        <w:rPr>
+          <w:lang w:val="en-US"/>
+        </w:rPr>
+        <w:t>HTTP</w:t>
+      </w:r>
+      <w:r>
+        <w:t xml:space="preserve"> на </w:t>
+      </w:r>
+      <w:r>
+        <w:rPr>
+          <w:lang w:val="en-US"/>
+        </w:rPr>
+        <w:t>PC</w:t>
+      </w:r>
+      <w:r>
+        <w:t xml:space="preserve">1 </w:t>
+      </w:r>
+      <w:r>
+        <w:t xml:space="preserve">был запущен браузер. На нём по </w:t>
+      </w:r>
+      <w:r>
+        <w:rPr>
+          <w:lang w:val="en-US"/>
+        </w:rPr>
+        <w:t>URL</w:t>
+      </w:r>
+      <w:r>
+        <w:t xml:space="preserve"> были успешно</w:t>
+      </w:r>
+      <w:r>
+        <w:t xml:space="preserve"> </w:t>
+      </w:r>
+      <w:r>
+        <w:t xml:space="preserve">вызваны созданные ранее </w:t>
+      </w:r>
+      <w:r>
+        <w:rPr>
+          <w:lang w:val="en-US"/>
+        </w:rPr>
+        <w:t>HTTP</w:t>
+      </w:r>
+      <w:r>
+        <w:t>-</w:t>
+      </w:r>
+      <w:r>
+        <w:t>сервера (рисун</w:t>
+      </w:r>
+      <w:r>
+        <w:t>ки</w:t>
+      </w:r>
+      <w:r>
+        <w:t xml:space="preserve"> 3.1</w:t>
+      </w:r>
+      <w:r>
+        <w:t>0-3.11</w:t>
+      </w:r>
+      <w:r>
+        <w:t>).</w:t>
+      </w:r>
+    </w:p>
+    <w:p>
+      <w:pPr>
+        <w:rPr>
+          <w:lang w:val="en-US"/>
+        </w:rPr>
+      </w:pPr>
+    </w:p>
+    <w:p>
+      <w:pPr>
+        <w:ind w:firstLine="0"/>
+        <w:jc w:val="center"/>
+        <w:rPr>
+          <w:lang w:val="en-US"/>
+        </w:rPr>
+      </w:pPr>
+      <w:r>
+        <w:lastRenderedPageBreak/>
+        <w:drawing>
+          <wp:inline distT="0" distB="0" distL="0" distR="0" wp14:anchorId="733785B6" wp14:editId="551EB419">
+            <wp:extent cx="5698343" cy="1714500"/>
+            <wp:effectExtent l="0" t="0" r="0" b="0"/>
+            <wp:docPr id="197338732" name="Рисунок 1"/>
+            <wp:cNvGraphicFramePr>
+              <a:graphicFrameLocks xmlns:a="http://schemas.openxmlformats.org/drawingml/2006/main" noChangeAspect="1"/>
+            </wp:cNvGraphicFramePr>
+            <a:graphic xmlns:a="http://schemas.openxmlformats.org/drawingml/2006/main">
+              <a:graphicData uri="http://schemas.openxmlformats.org/drawingml/2006/picture">
+                <pic:pic xmlns:pic="http://schemas.openxmlformats.org/drawingml/2006/picture">
+                  <pic:nvPicPr>
+                    <pic:cNvPr id="197338732" name=""/>
+                    <pic:cNvPicPr/>
+                  </pic:nvPicPr>
+                  <pic:blipFill>
+                    <a:blip r:embed="rId18"/>
+                    <a:stretch>
+                      <a:fillRect/>
+                    </a:stretch>
+                  </pic:blipFill>
+                  <pic:spPr>
+                    <a:xfrm>
+                      <a:off x="0" y="0"/>
+                      <a:ext cx="5725036" cy="1722531"/>
+                    </a:xfrm>
+                    <a:prstGeom prst="rect">
+                      <a:avLst/>
+                    </a:prstGeom>
+                  </pic:spPr>
+                </pic:pic>
+              </a:graphicData>
+            </a:graphic>
+          </wp:inline>
+        </w:drawing>
+      </w:r>
+    </w:p>
+    <w:p>
+      <w:pPr>
+        <w:ind w:firstLine="0"/>
+        <w:jc w:val="center"/>
+      </w:pPr>
+      <w:r>
+        <w:t>Рисунок 3.1</w:t>
+      </w:r>
+      <w:r>
+        <w:t xml:space="preserve">0 </w:t>
+      </w:r>
+      <w:r>
+        <w:t xml:space="preserve">– Проверка доступа к сайту </w:t>
+      </w:r>
+      <w:r>
+        <w:rPr>
+          <w:lang w:val="en-US"/>
+        </w:rPr>
+        <w:t>sevsu</w:t>
+      </w:r>
+      <w:r>
+        <w:t>.</w:t>
+      </w:r>
+      <w:r>
+        <w:rPr>
+          <w:lang w:val="en-US"/>
+        </w:rPr>
+        <w:t>ru</w:t>
+      </w:r>
+    </w:p>
+    <w:p/>
+    <w:p>
+      <w:pPr>
+        <w:ind w:firstLine="0"/>
+        <w:jc w:val="center"/>
+        <w:rPr>
+          <w:lang w:val="en-US"/>
+        </w:rPr>
+      </w:pPr>
+      <w:r>
+        <w:drawing>
+          <wp:inline distT="0" distB="0" distL="0" distR="0" wp14:anchorId="0C4E1B5F" wp14:editId="1EFE5722">
+            <wp:extent cx="5575300" cy="1671859"/>
+            <wp:effectExtent l="0" t="0" r="0" b="0"/>
+            <wp:docPr id="404944726" name="Рисунок 1"/>
+            <wp:cNvGraphicFramePr>
+              <a:graphicFrameLocks xmlns:a="http://schemas.openxmlformats.org/drawingml/2006/main" noChangeAspect="1"/>
+            </wp:cNvGraphicFramePr>
+            <a:graphic xmlns:a="http://schemas.openxmlformats.org/drawingml/2006/main">
+              <a:graphicData uri="http://schemas.openxmlformats.org/drawingml/2006/picture">
+                <pic:pic xmlns:pic="http://schemas.openxmlformats.org/drawingml/2006/picture">
+                  <pic:nvPicPr>
+                    <pic:cNvPr id="404944726" name=""/>
+                    <pic:cNvPicPr/>
+                  </pic:nvPicPr>
+                  <pic:blipFill>
+                    <a:blip r:embed="rId19"/>
+                    <a:stretch>
+                      <a:fillRect/>
+                    </a:stretch>
+                  </pic:blipFill>
+                  <pic:spPr>
+                    <a:xfrm>
+                      <a:off x="0" y="0"/>
+                      <a:ext cx="5589924" cy="1676244"/>
+                    </a:xfrm>
+                    <a:prstGeom prst="rect">
+                      <a:avLst/>
+                    </a:prstGeom>
+                  </pic:spPr>
+                </pic:pic>
+              </a:graphicData>
+            </a:graphic>
+          </wp:inline>
+        </w:drawing>
+      </w:r>
+    </w:p>
+    <w:p>
+      <w:pPr>
+        <w:ind w:firstLine="0"/>
+        <w:jc w:val="center"/>
+      </w:pPr>
+      <w:r>
+        <w:t>Рисунок 3.1</w:t>
+      </w:r>
+      <w:r>
+        <w:t>1</w:t>
+      </w:r>
+      <w:r>
+        <w:t xml:space="preserve"> </w:t>
+      </w:r>
+      <w:r>
+        <w:t xml:space="preserve">– Проверка доступа к сайту </w:t>
+      </w:r>
+      <w:r>
+        <w:rPr>
+          <w:lang w:val="en-US"/>
+        </w:rPr>
+        <w:t>kaf</w:t>
+      </w:r>
+      <w:r>
+        <w:t>.</w:t>
+      </w:r>
+      <w:r>
+        <w:rPr>
+          <w:lang w:val="en-US"/>
+        </w:rPr>
+        <w:t>is</w:t>
+      </w:r>
+    </w:p>
+    <w:p>
+      <w:pPr>
+        <w:ind w:firstLine="0"/>
+        <w:jc w:val="center"/>
+        <w:rPr>
+          <w:lang w:val="en-US"/>
+        </w:rPr>
+      </w:pPr>
+    </w:p>
+    <w:p>
+      <w:r>
+        <w:t>При проверке пингования по имени сервера в режиме симуляции и анализе заголовков кадров и пакетов был выявлен следующий порядок действий:</w:t>
+      </w:r>
+    </w:p>
+    <w:p>
+      <w:pPr>
+        <w:pStyle w:val="aa"/>
+        <w:numPr>
+          <w:ilvl w:val="0"/>
+          <w:numId w:val="39"/>
+        </w:numPr>
+      </w:pPr>
+      <w:r>
+        <w:t>PC</w:t>
+      </w:r>
+      <w:r>
+        <w:t xml:space="preserve"> получает через</w:t>
+      </w:r>
+      <w:r>
+        <w:t xml:space="preserve"> DNS-</w:t>
+      </w:r>
+      <w:r>
+        <w:t>сервер</w:t>
+      </w:r>
+      <w:r>
+        <w:t xml:space="preserve"> </w:t>
+      </w:r>
+      <w:r>
+        <w:rPr>
+          <w:lang w:val="en-US"/>
+        </w:rPr>
+        <w:t>IP</w:t>
+      </w:r>
+      <w:r>
+        <w:t>-</w:t>
+      </w:r>
+      <w:r>
+        <w:t>адрес по указанному</w:t>
+      </w:r>
+      <w:r>
+        <w:t xml:space="preserve"> доменно</w:t>
+      </w:r>
+      <w:r>
+        <w:t xml:space="preserve">му </w:t>
+      </w:r>
+      <w:r>
+        <w:t>имени</w:t>
+      </w:r>
+      <w:r>
+        <w:t>;</w:t>
+      </w:r>
+    </w:p>
+    <w:p>
+      <w:pPr>
+        <w:pStyle w:val="aa"/>
+        <w:numPr>
+          <w:ilvl w:val="0"/>
+          <w:numId w:val="39"/>
+        </w:numPr>
+      </w:pPr>
+      <w:r>
+        <w:rPr>
+          <w:lang w:val="en-US"/>
+        </w:rPr>
+        <w:t>PC</w:t>
+      </w:r>
+      <w:r>
+        <w:t xml:space="preserve"> </w:t>
+      </w:r>
+      <w:r>
+        <w:t>формирует</w:t>
+      </w:r>
+      <w:r>
+        <w:t xml:space="preserve"> </w:t>
+      </w:r>
+      <w:r>
+        <w:rPr>
+          <w:lang w:val="en-US"/>
+        </w:rPr>
+        <w:t>ping</w:t>
+      </w:r>
+      <w:r>
+        <w:t xml:space="preserve"> </w:t>
+      </w:r>
+      <w:r>
+        <w:t>на</w:t>
+      </w:r>
+      <w:r>
+        <w:t xml:space="preserve"> </w:t>
+      </w:r>
+      <w:r>
+        <w:t xml:space="preserve">этот </w:t>
+      </w:r>
+      <w:r>
+        <w:rPr>
+          <w:lang w:val="en-US"/>
+        </w:rPr>
+        <w:t>IP</w:t>
+      </w:r>
+      <w:r>
+        <w:t>-</w:t>
+      </w:r>
+      <w:r>
+        <w:t>адрес</w:t>
+      </w:r>
+      <w:r>
+        <w:t xml:space="preserve"> и через промежуточные устройства обменивается с ними пакетами</w:t>
+      </w:r>
+      <w:r>
+        <w:t>;</w:t>
+      </w:r>
+    </w:p>
+    <w:p>
+      <w:pPr>
+        <w:rPr>
+          <w:lang w:val="en-US"/>
+        </w:rPr>
+      </w:pPr>
+    </w:p>
+    <w:p>
+      <w:pPr>
+        <w:rPr>
+          <w:lang w:val="en-US"/>
+        </w:rPr>
+      </w:pPr>
+    </w:p>
     <w:p>
       <w:pPr>
         <w:pStyle w:val="1"/>
@@ -818,19 +2312,90 @@
         <w:t>ВЫВОД</w:t>
       </w:r>
     </w:p>
-    <w:p>
-      <w:pPr>
-        <w:pStyle w:val="Default"/>
-      </w:pPr>
-    </w:p>
-    <w:p>
-      <w:r>
-        <w:t>.</w:t>
+    <w:p/>
+    <w:p>
+      <w:r>
+        <w:t>В ходе работы были исследованы особенности использования серверных служб стека протоколов TCP/IP и конфигурации серверов, реализующих эти службы</w:t>
+      </w:r>
+      <w:r>
+        <w:t xml:space="preserve">. </w:t>
+      </w:r>
+      <w:r>
+        <w:t>П</w:t>
+      </w:r>
+      <w:r>
+        <w:t>риобретены практические навыки конфигурации серверного сетевого оборудования.</w:t>
+      </w:r>
+    </w:p>
+    <w:p>
+      <w:r>
+        <w:lastRenderedPageBreak/>
+        <w:t xml:space="preserve">Средствами эмулятора </w:t>
+      </w:r>
+      <w:r>
+        <w:rPr>
+          <w:lang w:val="en-US"/>
+        </w:rPr>
+        <w:t>Cisco</w:t>
+      </w:r>
+      <w:r>
+        <w:t xml:space="preserve"> </w:t>
+      </w:r>
+      <w:r>
+        <w:rPr>
+          <w:lang w:val="en-US"/>
+        </w:rPr>
+        <w:t>Packet</w:t>
+      </w:r>
+      <w:r>
+        <w:t xml:space="preserve"> </w:t>
+      </w:r>
+      <w:r>
+        <w:rPr>
+          <w:lang w:val="en-US"/>
+        </w:rPr>
+        <w:t>Tracer</w:t>
+      </w:r>
+      <w:r>
+        <w:t xml:space="preserve"> </w:t>
+      </w:r>
+      <w:r>
+        <w:t>на практике была проведена реализована пошаговая</w:t>
+      </w:r>
+      <w:r>
+        <w:t xml:space="preserve"> настройка динамического распределения </w:t>
+      </w:r>
+      <w:r>
+        <w:rPr>
+          <w:lang w:val="en-US"/>
+        </w:rPr>
+        <w:t>IP</w:t>
+      </w:r>
+      <w:r>
+        <w:t>-адресов при помощи DHSP-сервера, настроены доменные имена при помощи DNS-сервера</w:t>
+      </w:r>
+      <w:r>
+        <w:t xml:space="preserve">, </w:t>
+      </w:r>
+      <w:r>
+        <w:t xml:space="preserve">создано несколько </w:t>
+      </w:r>
+      <w:r>
+        <w:rPr>
+          <w:lang w:val="en-US"/>
+        </w:rPr>
+        <w:t>HTTP</w:t>
+      </w:r>
+      <w:r>
+        <w:t>-</w:t>
+      </w:r>
+      <w:r>
+        <w:t>серверов.</w:t>
       </w:r>
     </w:p>
     <w:sectPr>
-      <w:headerReference w:type="default" r:id="rId9"/>
-      <w:headerReference w:type="first" r:id="rId10"/>
+      <w:headerReference w:type="default" r:id="rId20"/>
+      <w:headerReference w:type="first" r:id="rId21"/>
       <w:pgSz w:w="11906" w:h="16838"/>
       <w:pgMar w:top="851" w:right="567" w:bottom="851" w:left="1418" w:header="680" w:footer="680" w:gutter="0"/>
       <w:cols w:space="708"/>
@@ -1079,6 +2644,119 @@
     </w:lvl>
   </w:abstractNum>
   <w:abstractNum w:abstractNumId="1" w15:restartNumberingAfterBreak="0">
+    <w:nsid w:val="034B0798"/>
+    <w:multiLevelType w:val="hybridMultilevel"/>
+    <w:tmpl w:val="28ACC122"/>
+    <w:lvl w:ilvl="0" w:tplc="04190001">
+      <w:start w:val="1"/>
+      <w:numFmt w:val="bullet"/>
+      <w:lvlText w:val=""/>
+      <w:lvlJc w:val="left"/>
+      <w:pPr>
+        <w:ind w:left="1429" w:hanging="360"/>
+      </w:pPr>
+      <w:rPr>
+        <w:rFonts w:ascii="Symbol" w:hAnsi="Symbol" w:hint="default"/>
+      </w:rPr>
+    </w:lvl>
+    <w:lvl w:ilvl="1" w:tplc="04190003" w:tentative="1">
+      <w:start w:val="1"/>
+      <w:numFmt w:val="bullet"/>
+      <w:lvlText w:val="o"/>
+      <w:lvlJc w:val="left"/>
+      <w:pPr>
+        <w:ind w:left="2149" w:hanging="360"/>
+      </w:pPr>
+      <w:rPr>
+        <w:rFonts w:ascii="Courier New" w:hAnsi="Courier New" w:cs="Courier New" w:hint="default"/>
+      </w:rPr>
+    </w:lvl>
+    <w:lvl w:ilvl="2" w:tplc="04190005" w:tentative="1">
+      <w:start w:val="1"/>
+      <w:numFmt w:val="bullet"/>
+      <w:lvlText w:val=""/>
+      <w:lvlJc w:val="left"/>
+      <w:pPr>
+        <w:ind w:left="2869" w:hanging="360"/>
+      </w:pPr>
+      <w:rPr>
+        <w:rFonts w:ascii="Wingdings" w:hAnsi="Wingdings" w:hint="default"/>
+      </w:rPr>
+    </w:lvl>
+    <w:lvl w:ilvl="3" w:tplc="04190001" w:tentative="1">
+      <w:start w:val="1"/>
+      <w:numFmt w:val="bullet"/>
+      <w:lvlText w:val=""/>
+      <w:lvlJc w:val="left"/>
+      <w:pPr>
+        <w:ind w:left="3589" w:hanging="360"/>
+      </w:pPr>
+      <w:rPr>
+        <w:rFonts w:ascii="Symbol" w:hAnsi="Symbol" w:hint="default"/>
+      </w:rPr>
+    </w:lvl>
+    <w:lvl w:ilvl="4" w:tplc="04190003" w:tentative="1">
+      <w:start w:val="1"/>
+      <w:numFmt w:val="bullet"/>
+      <w:lvlText w:val="o"/>
+      <w:lvlJc w:val="left"/>
+      <w:pPr>
+        <w:ind w:left="4309" w:hanging="360"/>
+      </w:pPr>
+      <w:rPr>
+        <w:rFonts w:ascii="Courier New" w:hAnsi="Courier New" w:cs="Courier New" w:hint="default"/>
+      </w:rPr>
+    </w:lvl>
+    <w:lvl w:ilvl="5" w:tplc="04190005" w:tentative="1">
+      <w:start w:val="1"/>
+      <w:numFmt w:val="bullet"/>
+      <w:lvlText w:val=""/>
+      <w:lvlJc w:val="left"/>
+      <w:pPr>
+        <w:ind w:left="5029" w:hanging="360"/>
+      </w:pPr>
+      <w:rPr>
+        <w:rFonts w:ascii="Wingdings" w:hAnsi="Wingdings" w:hint="default"/>
+      </w:rPr>
+    </w:lvl>
+    <w:lvl w:ilvl="6" w:tplc="04190001" w:tentative="1">
+      <w:start w:val="1"/>
+      <w:numFmt w:val="bullet"/>
+      <w:lvlText w:val=""/>
+      <w:lvlJc w:val="left"/>
+      <w:pPr>
+        <w:ind w:left="5749" w:hanging="360"/>
+      </w:pPr>
+      <w:rPr>
+        <w:rFonts w:ascii="Symbol" w:hAnsi="Symbol" w:hint="default"/>
+      </w:rPr>
+    </w:lvl>
+    <w:lvl w:ilvl="7" w:tplc="04190003" w:tentative="1">
+      <w:start w:val="1"/>
+      <w:numFmt w:val="bullet"/>
+      <w:lvlText w:val="o"/>
+      <w:lvlJc w:val="left"/>
+      <w:pPr>
+        <w:ind w:left="6469" w:hanging="360"/>
+      </w:pPr>
+      <w:rPr>
+        <w:rFonts w:ascii="Courier New" w:hAnsi="Courier New" w:cs="Courier New" w:hint="default"/>
+      </w:rPr>
+    </w:lvl>
+    <w:lvl w:ilvl="8" w:tplc="04190005" w:tentative="1">
+      <w:start w:val="1"/>
+      <w:numFmt w:val="bullet"/>
+      <w:lvlText w:val=""/>
+      <w:lvlJc w:val="left"/>
+      <w:pPr>
+        <w:ind w:left="7189" w:hanging="360"/>
+      </w:pPr>
+      <w:rPr>
+        <w:rFonts w:ascii="Wingdings" w:hAnsi="Wingdings" w:hint="default"/>
+      </w:rPr>
+    </w:lvl>
+  </w:abstractNum>
+  <w:abstractNum w:abstractNumId="2" w15:restartNumberingAfterBreak="0">
     <w:nsid w:val="03D95974"/>
     <w:multiLevelType w:val="hybridMultilevel"/>
     <w:tmpl w:val="94E49BBE"/>
@@ -1167,7 +2845,7 @@
       </w:pPr>
     </w:lvl>
   </w:abstractNum>
-  <w:abstractNum w:abstractNumId="2" w15:restartNumberingAfterBreak="0">
+  <w:abstractNum w:abstractNumId="3" w15:restartNumberingAfterBreak="0">
     <w:nsid w:val="04EF6558"/>
     <w:multiLevelType w:val="multilevel"/>
     <w:tmpl w:val="0419001F"/>
@@ -1253,7 +2931,7 @@
       </w:pPr>
     </w:lvl>
   </w:abstractNum>
-  <w:abstractNum w:abstractNumId="3" w15:restartNumberingAfterBreak="0">
+  <w:abstractNum w:abstractNumId="4" w15:restartNumberingAfterBreak="0">
     <w:nsid w:val="073A59B1"/>
     <w:multiLevelType w:val="hybridMultilevel"/>
     <w:tmpl w:val="511E53CA"/>
@@ -1339,10 +3017,10 @@
       </w:pPr>
     </w:lvl>
   </w:abstractNum>
-  <w:abstractNum w:abstractNumId="4" w15:restartNumberingAfterBreak="0">
+  <w:abstractNum w:abstractNumId="5" w15:restartNumberingAfterBreak="0">
     <w:nsid w:val="078F380C"/>
     <w:multiLevelType w:val="hybridMultilevel"/>
-    <w:tmpl w:val="15E2C9D2"/>
+    <w:tmpl w:val="29BC79D2"/>
     <w:lvl w:ilvl="0" w:tplc="471E975A">
       <w:start w:val="1"/>
       <w:numFmt w:val="decimal"/>
@@ -1364,14 +3042,16 @@
         <w:ind w:left="2149" w:hanging="360"/>
       </w:pPr>
     </w:lvl>
-    <w:lvl w:ilvl="2" w:tplc="0419001B" w:tentative="1">
-      <w:start w:val="1"/>
-      <w:numFmt w:val="lowerRoman"/>
-      <w:lvlText w:val="%3."/>
-      <w:lvlJc w:val="right"/>
-      <w:pPr>
-        <w:ind w:left="2869" w:hanging="180"/>
-      </w:pPr>
+    <w:lvl w:ilvl="2" w:tplc="DC6CB1B2">
+      <w:numFmt w:val="bullet"/>
+      <w:lvlText w:val="•"/>
+      <w:lvlJc w:val="left"/>
+      <w:pPr>
+        <w:ind w:left="3399" w:hanging="710"/>
+      </w:pPr>
+      <w:rPr>
+        <w:rFonts w:ascii="Times New Roman" w:eastAsiaTheme="minorHAnsi" w:hAnsi="Times New Roman" w:cs="Times New Roman" w:hint="default"/>
+      </w:rPr>
     </w:lvl>
     <w:lvl w:ilvl="3" w:tplc="0419000F" w:tentative="1">
       <w:start w:val="1"/>
@@ -1428,7 +3108,120 @@
       </w:pPr>
     </w:lvl>
   </w:abstractNum>
-  <w:abstractNum w:abstractNumId="5" w15:restartNumberingAfterBreak="0">
+  <w:abstractNum w:abstractNumId="6" w15:restartNumberingAfterBreak="0">
+    <w:nsid w:val="11867D97"/>
+    <w:multiLevelType w:val="hybridMultilevel"/>
+    <w:tmpl w:val="98B008CC"/>
+    <w:lvl w:ilvl="0" w:tplc="04190001">
+      <w:start w:val="1"/>
+      <w:numFmt w:val="bullet"/>
+      <w:lvlText w:val=""/>
+      <w:lvlJc w:val="left"/>
+      <w:pPr>
+        <w:ind w:left="1429" w:hanging="360"/>
+      </w:pPr>
+      <w:rPr>
+        <w:rFonts w:ascii="Symbol" w:hAnsi="Symbol" w:hint="default"/>
+      </w:rPr>
+    </w:lvl>
+    <w:lvl w:ilvl="1" w:tplc="04190003" w:tentative="1">
+      <w:start w:val="1"/>
+      <w:numFmt w:val="bullet"/>
+      <w:lvlText w:val="o"/>
+      <w:lvlJc w:val="left"/>
+      <w:pPr>
+        <w:ind w:left="2149" w:hanging="360"/>
+      </w:pPr>
+      <w:rPr>
+        <w:rFonts w:ascii="Courier New" w:hAnsi="Courier New" w:cs="Courier New" w:hint="default"/>
+      </w:rPr>
+    </w:lvl>
+    <w:lvl w:ilvl="2" w:tplc="04190005" w:tentative="1">
+      <w:start w:val="1"/>
+      <w:numFmt w:val="bullet"/>
+      <w:lvlText w:val=""/>
+      <w:lvlJc w:val="left"/>
+      <w:pPr>
+        <w:ind w:left="2869" w:hanging="360"/>
+      </w:pPr>
+      <w:rPr>
+        <w:rFonts w:ascii="Wingdings" w:hAnsi="Wingdings" w:hint="default"/>
+      </w:rPr>
+    </w:lvl>
+    <w:lvl w:ilvl="3" w:tplc="04190001" w:tentative="1">
+      <w:start w:val="1"/>
+      <w:numFmt w:val="bullet"/>
+      <w:lvlText w:val=""/>
+      <w:lvlJc w:val="left"/>
+      <w:pPr>
+        <w:ind w:left="3589" w:hanging="360"/>
+      </w:pPr>
+      <w:rPr>
+        <w:rFonts w:ascii="Symbol" w:hAnsi="Symbol" w:hint="default"/>
+      </w:rPr>
+    </w:lvl>
+    <w:lvl w:ilvl="4" w:tplc="04190003" w:tentative="1">
+      <w:start w:val="1"/>
+      <w:numFmt w:val="bullet"/>
+      <w:lvlText w:val="o"/>
+      <w:lvlJc w:val="left"/>
+      <w:pPr>
+        <w:ind w:left="4309" w:hanging="360"/>
+      </w:pPr>
+      <w:rPr>
+        <w:rFonts w:ascii="Courier New" w:hAnsi="Courier New" w:cs="Courier New" w:hint="default"/>
+      </w:rPr>
+    </w:lvl>
+    <w:lvl w:ilvl="5" w:tplc="04190005" w:tentative="1">
+      <w:start w:val="1"/>
+      <w:numFmt w:val="bullet"/>
+      <w:lvlText w:val=""/>
+      <w:lvlJc w:val="left"/>
+      <w:pPr>
+        <w:ind w:left="5029" w:hanging="360"/>
+      </w:pPr>
+      <w:rPr>
+        <w:rFonts w:ascii="Wingdings" w:hAnsi="Wingdings" w:hint="default"/>
+      </w:rPr>
+    </w:lvl>
+    <w:lvl w:ilvl="6" w:tplc="04190001" w:tentative="1">
+      <w:start w:val="1"/>
+      <w:numFmt w:val="bullet"/>
+      <w:lvlText w:val=""/>
+      <w:lvlJc w:val="left"/>
+      <w:pPr>
+        <w:ind w:left="5749" w:hanging="360"/>
+      </w:pPr>
+      <w:rPr>
+        <w:rFonts w:ascii="Symbol" w:hAnsi="Symbol" w:hint="default"/>
+      </w:rPr>
+    </w:lvl>
+    <w:lvl w:ilvl="7" w:tplc="04190003" w:tentative="1">
+      <w:start w:val="1"/>
+      <w:numFmt w:val="bullet"/>
+      <w:lvlText w:val="o"/>
+      <w:lvlJc w:val="left"/>
+      <w:pPr>
+        <w:ind w:left="6469" w:hanging="360"/>
+      </w:pPr>
+      <w:rPr>
+        <w:rFonts w:ascii="Courier New" w:hAnsi="Courier New" w:cs="Courier New" w:hint="default"/>
+      </w:rPr>
+    </w:lvl>
+    <w:lvl w:ilvl="8" w:tplc="04190005" w:tentative="1">
+      <w:start w:val="1"/>
+      <w:numFmt w:val="bullet"/>
+      <w:lvlText w:val=""/>
+      <w:lvlJc w:val="left"/>
+      <w:pPr>
+        <w:ind w:left="7189" w:hanging="360"/>
+      </w:pPr>
+      <w:rPr>
+        <w:rFonts w:ascii="Wingdings" w:hAnsi="Wingdings" w:hint="default"/>
+      </w:rPr>
+    </w:lvl>
+  </w:abstractNum>
+  <w:abstractNum w:abstractNumId="7" w15:restartNumberingAfterBreak="0">
     <w:nsid w:val="17432CE4"/>
     <w:multiLevelType w:val="hybridMultilevel"/>
     <w:tmpl w:val="4A0AF04C"/>
@@ -1517,7 +3310,7 @@
       </w:pPr>
     </w:lvl>
   </w:abstractNum>
-  <w:abstractNum w:abstractNumId="6" w15:restartNumberingAfterBreak="0">
+  <w:abstractNum w:abstractNumId="8" w15:restartNumberingAfterBreak="0">
     <w:nsid w:val="1E8D4413"/>
     <w:multiLevelType w:val="multilevel"/>
     <w:tmpl w:val="B28C396C"/>
@@ -1630,7 +3423,7 @@
       </w:rPr>
     </w:lvl>
   </w:abstractNum>
-  <w:abstractNum w:abstractNumId="7" w15:restartNumberingAfterBreak="0">
+  <w:abstractNum w:abstractNumId="9" w15:restartNumberingAfterBreak="0">
     <w:nsid w:val="20273192"/>
     <w:multiLevelType w:val="multilevel"/>
     <w:tmpl w:val="0419001F"/>
@@ -1716,7 +3509,7 @@
       </w:pPr>
     </w:lvl>
   </w:abstractNum>
-  <w:abstractNum w:abstractNumId="8" w15:restartNumberingAfterBreak="0">
+  <w:abstractNum w:abstractNumId="10" w15:restartNumberingAfterBreak="0">
     <w:nsid w:val="240D3BC1"/>
     <w:multiLevelType w:val="hybridMultilevel"/>
     <w:tmpl w:val="25D00114"/>
@@ -1808,7 +3601,7 @@
       </w:pPr>
     </w:lvl>
   </w:abstractNum>
-  <w:abstractNum w:abstractNumId="9" w15:restartNumberingAfterBreak="0">
+  <w:abstractNum w:abstractNumId="11" w15:restartNumberingAfterBreak="0">
     <w:nsid w:val="2A472C4F"/>
     <w:multiLevelType w:val="hybridMultilevel"/>
     <w:tmpl w:val="801AF828"/>
@@ -1900,7 +3693,7 @@
       </w:pPr>
     </w:lvl>
   </w:abstractNum>
-  <w:abstractNum w:abstractNumId="10" w15:restartNumberingAfterBreak="0">
+  <w:abstractNum w:abstractNumId="12" w15:restartNumberingAfterBreak="0">
     <w:nsid w:val="2B824610"/>
     <w:multiLevelType w:val="multilevel"/>
     <w:tmpl w:val="0419001F"/>
@@ -1986,7 +3779,7 @@
       </w:pPr>
     </w:lvl>
   </w:abstractNum>
-  <w:abstractNum w:abstractNumId="11" w15:restartNumberingAfterBreak="0">
+  <w:abstractNum w:abstractNumId="13" w15:restartNumberingAfterBreak="0">
     <w:nsid w:val="2C382D2C"/>
     <w:multiLevelType w:val="hybridMultilevel"/>
     <w:tmpl w:val="69484610"/>
@@ -2099,7 +3892,7 @@
       </w:rPr>
     </w:lvl>
   </w:abstractNum>
-  <w:abstractNum w:abstractNumId="12" w15:restartNumberingAfterBreak="0">
+  <w:abstractNum w:abstractNumId="14" w15:restartNumberingAfterBreak="0">
     <w:nsid w:val="2D4D1AFF"/>
     <w:multiLevelType w:val="hybridMultilevel"/>
     <w:tmpl w:val="C3EE1132"/>
@@ -2212,7 +4005,7 @@
       </w:rPr>
     </w:lvl>
   </w:abstractNum>
-  <w:abstractNum w:abstractNumId="13" w15:restartNumberingAfterBreak="0">
+  <w:abstractNum w:abstractNumId="15" w15:restartNumberingAfterBreak="0">
     <w:nsid w:val="2E4F422D"/>
     <w:multiLevelType w:val="hybridMultilevel"/>
     <w:tmpl w:val="F738AC18"/>
@@ -2301,7 +4094,7 @@
       </w:pPr>
     </w:lvl>
   </w:abstractNum>
-  <w:abstractNum w:abstractNumId="14" w15:restartNumberingAfterBreak="0">
+  <w:abstractNum w:abstractNumId="16" w15:restartNumberingAfterBreak="0">
     <w:nsid w:val="2F7E24C5"/>
     <w:multiLevelType w:val="hybridMultilevel"/>
     <w:tmpl w:val="F3F45AB2"/>
@@ -2390,7 +4183,120 @@
       </w:pPr>
     </w:lvl>
   </w:abstractNum>
-  <w:abstractNum w:abstractNumId="15" w15:restartNumberingAfterBreak="0">
+  <w:abstractNum w:abstractNumId="17" w15:restartNumberingAfterBreak="0">
+    <w:nsid w:val="34752A68"/>
+    <w:multiLevelType w:val="hybridMultilevel"/>
+    <w:tmpl w:val="1A2C6E38"/>
+    <w:lvl w:ilvl="0" w:tplc="04190001">
+      <w:start w:val="1"/>
+      <w:numFmt w:val="bullet"/>
+      <w:lvlText w:val=""/>
+      <w:lvlJc w:val="left"/>
+      <w:pPr>
+        <w:ind w:left="1429" w:hanging="360"/>
+      </w:pPr>
+      <w:rPr>
+        <w:rFonts w:ascii="Symbol" w:hAnsi="Symbol" w:hint="default"/>
+      </w:rPr>
+    </w:lvl>
+    <w:lvl w:ilvl="1" w:tplc="04190003" w:tentative="1">
+      <w:start w:val="1"/>
+      <w:numFmt w:val="bullet"/>
+      <w:lvlText w:val="o"/>
+      <w:lvlJc w:val="left"/>
+      <w:pPr>
+        <w:ind w:left="2149" w:hanging="360"/>
+      </w:pPr>
+      <w:rPr>
+        <w:rFonts w:ascii="Courier New" w:hAnsi="Courier New" w:cs="Courier New" w:hint="default"/>
+      </w:rPr>
+    </w:lvl>
+    <w:lvl w:ilvl="2" w:tplc="04190005" w:tentative="1">
+      <w:start w:val="1"/>
+      <w:numFmt w:val="bullet"/>
+      <w:lvlText w:val=""/>
+      <w:lvlJc w:val="left"/>
+      <w:pPr>
+        <w:ind w:left="2869" w:hanging="360"/>
+      </w:pPr>
+      <w:rPr>
+        <w:rFonts w:ascii="Wingdings" w:hAnsi="Wingdings" w:hint="default"/>
+      </w:rPr>
+    </w:lvl>
+    <w:lvl w:ilvl="3" w:tplc="04190001" w:tentative="1">
+      <w:start w:val="1"/>
+      <w:numFmt w:val="bullet"/>
+      <w:lvlText w:val=""/>
+      <w:lvlJc w:val="left"/>
+      <w:pPr>
+        <w:ind w:left="3589" w:hanging="360"/>
+      </w:pPr>
+      <w:rPr>
+        <w:rFonts w:ascii="Symbol" w:hAnsi="Symbol" w:hint="default"/>
+      </w:rPr>
+    </w:lvl>
+    <w:lvl w:ilvl="4" w:tplc="04190003" w:tentative="1">
+      <w:start w:val="1"/>
+      <w:numFmt w:val="bullet"/>
+      <w:lvlText w:val="o"/>
+      <w:lvlJc w:val="left"/>
+      <w:pPr>
+        <w:ind w:left="4309" w:hanging="360"/>
+      </w:pPr>
+      <w:rPr>
+        <w:rFonts w:ascii="Courier New" w:hAnsi="Courier New" w:cs="Courier New" w:hint="default"/>
+      </w:rPr>
+    </w:lvl>
+    <w:lvl w:ilvl="5" w:tplc="04190005" w:tentative="1">
+      <w:start w:val="1"/>
+      <w:numFmt w:val="bullet"/>
+      <w:lvlText w:val=""/>
+      <w:lvlJc w:val="left"/>
+      <w:pPr>
+        <w:ind w:left="5029" w:hanging="360"/>
+      </w:pPr>
+      <w:rPr>
+        <w:rFonts w:ascii="Wingdings" w:hAnsi="Wingdings" w:hint="default"/>
+      </w:rPr>
+    </w:lvl>
+    <w:lvl w:ilvl="6" w:tplc="04190001" w:tentative="1">
+      <w:start w:val="1"/>
+      <w:numFmt w:val="bullet"/>
+      <w:lvlText w:val=""/>
+      <w:lvlJc w:val="left"/>
+      <w:pPr>
+        <w:ind w:left="5749" w:hanging="360"/>
+      </w:pPr>
+      <w:rPr>
+        <w:rFonts w:ascii="Symbol" w:hAnsi="Symbol" w:hint="default"/>
+      </w:rPr>
+    </w:lvl>
+    <w:lvl w:ilvl="7" w:tplc="04190003" w:tentative="1">
+      <w:start w:val="1"/>
+      <w:numFmt w:val="bullet"/>
+      <w:lvlText w:val="o"/>
+      <w:lvlJc w:val="left"/>
+      <w:pPr>
+        <w:ind w:left="6469" w:hanging="360"/>
+      </w:pPr>
+      <w:rPr>
+        <w:rFonts w:ascii="Courier New" w:hAnsi="Courier New" w:cs="Courier New" w:hint="default"/>
+      </w:rPr>
+    </w:lvl>
+    <w:lvl w:ilvl="8" w:tplc="04190005" w:tentative="1">
+      <w:start w:val="1"/>
+      <w:numFmt w:val="bullet"/>
+      <w:lvlText w:val=""/>
+      <w:lvlJc w:val="left"/>
+      <w:pPr>
+        <w:ind w:left="7189" w:hanging="360"/>
+      </w:pPr>
+      <w:rPr>
+        <w:rFonts w:ascii="Wingdings" w:hAnsi="Wingdings" w:hint="default"/>
+      </w:rPr>
+    </w:lvl>
+  </w:abstractNum>
+  <w:abstractNum w:abstractNumId="18" w15:restartNumberingAfterBreak="0">
     <w:nsid w:val="34E14F36"/>
     <w:multiLevelType w:val="hybridMultilevel"/>
     <w:tmpl w:val="1910EDF0"/>
@@ -2479,7 +4385,7 @@
       </w:pPr>
     </w:lvl>
   </w:abstractNum>
-  <w:abstractNum w:abstractNumId="16" w15:restartNumberingAfterBreak="0">
+  <w:abstractNum w:abstractNumId="19" w15:restartNumberingAfterBreak="0">
     <w:nsid w:val="388D3C08"/>
     <w:multiLevelType w:val="hybridMultilevel"/>
     <w:tmpl w:val="0AB0413E"/>
@@ -2568,7 +4474,7 @@
       </w:pPr>
     </w:lvl>
   </w:abstractNum>
-  <w:abstractNum w:abstractNumId="17" w15:restartNumberingAfterBreak="0">
+  <w:abstractNum w:abstractNumId="20" w15:restartNumberingAfterBreak="0">
     <w:nsid w:val="39F10AD6"/>
     <w:multiLevelType w:val="hybridMultilevel"/>
     <w:tmpl w:val="3BE29F88"/>
@@ -2657,7 +4563,7 @@
       </w:pPr>
     </w:lvl>
   </w:abstractNum>
-  <w:abstractNum w:abstractNumId="18" w15:restartNumberingAfterBreak="0">
+  <w:abstractNum w:abstractNumId="21" w15:restartNumberingAfterBreak="0">
     <w:nsid w:val="3B70068A"/>
     <w:multiLevelType w:val="multilevel"/>
     <w:tmpl w:val="04A0EC32"/>
@@ -2770,7 +4676,120 @@
       </w:rPr>
     </w:lvl>
   </w:abstractNum>
-  <w:abstractNum w:abstractNumId="19" w15:restartNumberingAfterBreak="0">
+  <w:abstractNum w:abstractNumId="22" w15:restartNumberingAfterBreak="0">
+    <w:nsid w:val="3D9A77C5"/>
+    <w:multiLevelType w:val="hybridMultilevel"/>
+    <w:tmpl w:val="2586FFBC"/>
+    <w:lvl w:ilvl="0" w:tplc="04190001">
+      <w:start w:val="1"/>
+      <w:numFmt w:val="bullet"/>
+      <w:lvlText w:val=""/>
+      <w:lvlJc w:val="left"/>
+      <w:pPr>
+        <w:ind w:left="3409" w:hanging="360"/>
+      </w:pPr>
+      <w:rPr>
+        <w:rFonts w:ascii="Symbol" w:hAnsi="Symbol" w:hint="default"/>
+      </w:rPr>
+    </w:lvl>
+    <w:lvl w:ilvl="1" w:tplc="04190003" w:tentative="1">
+      <w:start w:val="1"/>
+      <w:numFmt w:val="bullet"/>
+      <w:lvlText w:val="o"/>
+      <w:lvlJc w:val="left"/>
+      <w:pPr>
+        <w:ind w:left="4129" w:hanging="360"/>
+      </w:pPr>
+      <w:rPr>
+        <w:rFonts w:ascii="Courier New" w:hAnsi="Courier New" w:cs="Courier New" w:hint="default"/>
+      </w:rPr>
+    </w:lvl>
+    <w:lvl w:ilvl="2" w:tplc="04190005" w:tentative="1">
+      <w:start w:val="1"/>
+      <w:numFmt w:val="bullet"/>
+      <w:lvlText w:val=""/>
+      <w:lvlJc w:val="left"/>
+      <w:pPr>
+        <w:ind w:left="4849" w:hanging="360"/>
+      </w:pPr>
+      <w:rPr>
+        <w:rFonts w:ascii="Wingdings" w:hAnsi="Wingdings" w:hint="default"/>
+      </w:rPr>
+    </w:lvl>
+    <w:lvl w:ilvl="3" w:tplc="04190001" w:tentative="1">
+      <w:start w:val="1"/>
+      <w:numFmt w:val="bullet"/>
+      <w:lvlText w:val=""/>
+      <w:lvlJc w:val="left"/>
+      <w:pPr>
+        <w:ind w:left="5569" w:hanging="360"/>
+      </w:pPr>
+      <w:rPr>
+        <w:rFonts w:ascii="Symbol" w:hAnsi="Symbol" w:hint="default"/>
+      </w:rPr>
+    </w:lvl>
+    <w:lvl w:ilvl="4" w:tplc="04190003" w:tentative="1">
+      <w:start w:val="1"/>
+      <w:numFmt w:val="bullet"/>
+      <w:lvlText w:val="o"/>
+      <w:lvlJc w:val="left"/>
+      <w:pPr>
+        <w:ind w:left="6289" w:hanging="360"/>
+      </w:pPr>
+      <w:rPr>
+        <w:rFonts w:ascii="Courier New" w:hAnsi="Courier New" w:cs="Courier New" w:hint="default"/>
+      </w:rPr>
+    </w:lvl>
+    <w:lvl w:ilvl="5" w:tplc="04190005" w:tentative="1">
+      <w:start w:val="1"/>
+      <w:numFmt w:val="bullet"/>
+      <w:lvlText w:val=""/>
+      <w:lvlJc w:val="left"/>
+      <w:pPr>
+        <w:ind w:left="7009" w:hanging="360"/>
+      </w:pPr>
+      <w:rPr>
+        <w:rFonts w:ascii="Wingdings" w:hAnsi="Wingdings" w:hint="default"/>
+      </w:rPr>
+    </w:lvl>
+    <w:lvl w:ilvl="6" w:tplc="04190001" w:tentative="1">
+      <w:start w:val="1"/>
+      <w:numFmt w:val="bullet"/>
+      <w:lvlText w:val=""/>
+      <w:lvlJc w:val="left"/>
+      <w:pPr>
+        <w:ind w:left="7729" w:hanging="360"/>
+      </w:pPr>
+      <w:rPr>
+        <w:rFonts w:ascii="Symbol" w:hAnsi="Symbol" w:hint="default"/>
+      </w:rPr>
+    </w:lvl>
+    <w:lvl w:ilvl="7" w:tplc="04190003" w:tentative="1">
+      <w:start w:val="1"/>
+      <w:numFmt w:val="bullet"/>
+      <w:lvlText w:val="o"/>
+      <w:lvlJc w:val="left"/>
+      <w:pPr>
+        <w:ind w:left="8449" w:hanging="360"/>
+      </w:pPr>
+      <w:rPr>
+        <w:rFonts w:ascii="Courier New" w:hAnsi="Courier New" w:cs="Courier New" w:hint="default"/>
+      </w:rPr>
+    </w:lvl>
+    <w:lvl w:ilvl="8" w:tplc="04190005" w:tentative="1">
+      <w:start w:val="1"/>
+      <w:numFmt w:val="bullet"/>
+      <w:lvlText w:val=""/>
+      <w:lvlJc w:val="left"/>
+      <w:pPr>
+        <w:ind w:left="9169" w:hanging="360"/>
+      </w:pPr>
+      <w:rPr>
+        <w:rFonts w:ascii="Wingdings" w:hAnsi="Wingdings" w:hint="default"/>
+      </w:rPr>
+    </w:lvl>
+  </w:abstractNum>
+  <w:abstractNum w:abstractNumId="23" w15:restartNumberingAfterBreak="0">
     <w:nsid w:val="3E174836"/>
     <w:multiLevelType w:val="hybridMultilevel"/>
     <w:tmpl w:val="67104976"/>
@@ -2859,7 +4878,7 @@
       </w:pPr>
     </w:lvl>
   </w:abstractNum>
-  <w:abstractNum w:abstractNumId="20" w15:restartNumberingAfterBreak="0">
+  <w:abstractNum w:abstractNumId="24" w15:restartNumberingAfterBreak="0">
     <w:nsid w:val="407205B6"/>
     <w:multiLevelType w:val="hybridMultilevel"/>
     <w:tmpl w:val="3FCA9934"/>
@@ -2951,7 +4970,7 @@
       </w:pPr>
     </w:lvl>
   </w:abstractNum>
-  <w:abstractNum w:abstractNumId="21" w15:restartNumberingAfterBreak="0">
+  <w:abstractNum w:abstractNumId="25" w15:restartNumberingAfterBreak="0">
     <w:nsid w:val="46DA515B"/>
     <w:multiLevelType w:val="hybridMultilevel"/>
     <w:tmpl w:val="ACDE5A36"/>
@@ -3040,7 +5059,7 @@
       </w:pPr>
     </w:lvl>
   </w:abstractNum>
-  <w:abstractNum w:abstractNumId="22" w15:restartNumberingAfterBreak="0">
+  <w:abstractNum w:abstractNumId="26" w15:restartNumberingAfterBreak="0">
     <w:nsid w:val="49B32C19"/>
     <w:multiLevelType w:val="hybridMultilevel"/>
     <w:tmpl w:val="2F903250"/>
@@ -3129,7 +5148,7 @@
       </w:pPr>
     </w:lvl>
   </w:abstractNum>
-  <w:abstractNum w:abstractNumId="23" w15:restartNumberingAfterBreak="0">
+  <w:abstractNum w:abstractNumId="27" w15:restartNumberingAfterBreak="0">
     <w:nsid w:val="4C715EE2"/>
     <w:multiLevelType w:val="multilevel"/>
     <w:tmpl w:val="0419001F"/>
@@ -3215,7 +5234,7 @@
       </w:pPr>
     </w:lvl>
   </w:abstractNum>
-  <w:abstractNum w:abstractNumId="24" w15:restartNumberingAfterBreak="0">
+  <w:abstractNum w:abstractNumId="28" w15:restartNumberingAfterBreak="0">
     <w:nsid w:val="4E944F8B"/>
     <w:multiLevelType w:val="hybridMultilevel"/>
     <w:tmpl w:val="F06E6690"/>
@@ -3305,7 +5324,7 @@
       </w:pPr>
     </w:lvl>
   </w:abstractNum>
-  <w:abstractNum w:abstractNumId="25" w15:restartNumberingAfterBreak="0">
+  <w:abstractNum w:abstractNumId="29" w15:restartNumberingAfterBreak="0">
     <w:nsid w:val="518E0CD4"/>
     <w:multiLevelType w:val="hybridMultilevel"/>
     <w:tmpl w:val="9B30EEBC"/>
@@ -3391,7 +5410,120 @@
       </w:pPr>
     </w:lvl>
   </w:abstractNum>
-  <w:abstractNum w:abstractNumId="26" w15:restartNumberingAfterBreak="0">
+  <w:abstractNum w:abstractNumId="30" w15:restartNumberingAfterBreak="0">
+    <w:nsid w:val="600E41DC"/>
+    <w:multiLevelType w:val="hybridMultilevel"/>
+    <w:tmpl w:val="C4E40D20"/>
+    <w:lvl w:ilvl="0" w:tplc="04190001">
+      <w:start w:val="1"/>
+      <w:numFmt w:val="bullet"/>
+      <w:lvlText w:val=""/>
+      <w:lvlJc w:val="left"/>
+      <w:pPr>
+        <w:ind w:left="1429" w:hanging="360"/>
+      </w:pPr>
+      <w:rPr>
+        <w:rFonts w:ascii="Symbol" w:hAnsi="Symbol" w:hint="default"/>
+      </w:rPr>
+    </w:lvl>
+    <w:lvl w:ilvl="1" w:tplc="04190003" w:tentative="1">
+      <w:start w:val="1"/>
+      <w:numFmt w:val="bullet"/>
+      <w:lvlText w:val="o"/>
+      <w:lvlJc w:val="left"/>
+      <w:pPr>
+        <w:ind w:left="2149" w:hanging="360"/>
+      </w:pPr>
+      <w:rPr>
+        <w:rFonts w:ascii="Courier New" w:hAnsi="Courier New" w:cs="Courier New" w:hint="default"/>
+      </w:rPr>
+    </w:lvl>
+    <w:lvl w:ilvl="2" w:tplc="04190005" w:tentative="1">
+      <w:start w:val="1"/>
+      <w:numFmt w:val="bullet"/>
+      <w:lvlText w:val=""/>
+      <w:lvlJc w:val="left"/>
+      <w:pPr>
+        <w:ind w:left="2869" w:hanging="360"/>
+      </w:pPr>
+      <w:rPr>
+        <w:rFonts w:ascii="Wingdings" w:hAnsi="Wingdings" w:hint="default"/>
+      </w:rPr>
+    </w:lvl>
+    <w:lvl w:ilvl="3" w:tplc="04190001" w:tentative="1">
+      <w:start w:val="1"/>
+      <w:numFmt w:val="bullet"/>
+      <w:lvlText w:val=""/>
+      <w:lvlJc w:val="left"/>
+      <w:pPr>
+        <w:ind w:left="3589" w:hanging="360"/>
+      </w:pPr>
+      <w:rPr>
+        <w:rFonts w:ascii="Symbol" w:hAnsi="Symbol" w:hint="default"/>
+      </w:rPr>
+    </w:lvl>
+    <w:lvl w:ilvl="4" w:tplc="04190003" w:tentative="1">
+      <w:start w:val="1"/>
+      <w:numFmt w:val="bullet"/>
+      <w:lvlText w:val="o"/>
+      <w:lvlJc w:val="left"/>
+      <w:pPr>
+        <w:ind w:left="4309" w:hanging="360"/>
+      </w:pPr>
+      <w:rPr>
+        <w:rFonts w:ascii="Courier New" w:hAnsi="Courier New" w:cs="Courier New" w:hint="default"/>
+      </w:rPr>
+    </w:lvl>
+    <w:lvl w:ilvl="5" w:tplc="04190005" w:tentative="1">
+      <w:start w:val="1"/>
+      <w:numFmt w:val="bullet"/>
+      <w:lvlText w:val=""/>
+      <w:lvlJc w:val="left"/>
+      <w:pPr>
+        <w:ind w:left="5029" w:hanging="360"/>
+      </w:pPr>
+      <w:rPr>
+        <w:rFonts w:ascii="Wingdings" w:hAnsi="Wingdings" w:hint="default"/>
+      </w:rPr>
+    </w:lvl>
+    <w:lvl w:ilvl="6" w:tplc="04190001" w:tentative="1">
+      <w:start w:val="1"/>
+      <w:numFmt w:val="bullet"/>
+      <w:lvlText w:val=""/>
+      <w:lvlJc w:val="left"/>
+      <w:pPr>
+        <w:ind w:left="5749" w:hanging="360"/>
+      </w:pPr>
+      <w:rPr>
+        <w:rFonts w:ascii="Symbol" w:hAnsi="Symbol" w:hint="default"/>
+      </w:rPr>
+    </w:lvl>
+    <w:lvl w:ilvl="7" w:tplc="04190003" w:tentative="1">
+      <w:start w:val="1"/>
+      <w:numFmt w:val="bullet"/>
+      <w:lvlText w:val="o"/>
+      <w:lvlJc w:val="left"/>
+      <w:pPr>
+        <w:ind w:left="6469" w:hanging="360"/>
+      </w:pPr>
+      <w:rPr>
+        <w:rFonts w:ascii="Courier New" w:hAnsi="Courier New" w:cs="Courier New" w:hint="default"/>
+      </w:rPr>
+    </w:lvl>
+    <w:lvl w:ilvl="8" w:tplc="04190005" w:tentative="1">
+      <w:start w:val="1"/>
+      <w:numFmt w:val="bullet"/>
+      <w:lvlText w:val=""/>
+      <w:lvlJc w:val="left"/>
+      <w:pPr>
+        <w:ind w:left="7189" w:hanging="360"/>
+      </w:pPr>
+      <w:rPr>
+        <w:rFonts w:ascii="Wingdings" w:hAnsi="Wingdings" w:hint="default"/>
+      </w:rPr>
+    </w:lvl>
+  </w:abstractNum>
+  <w:abstractNum w:abstractNumId="31" w15:restartNumberingAfterBreak="0">
     <w:nsid w:val="693C7413"/>
     <w:multiLevelType w:val="hybridMultilevel"/>
     <w:tmpl w:val="F782FA18"/>
@@ -3483,7 +5615,7 @@
       </w:pPr>
     </w:lvl>
   </w:abstractNum>
-  <w:abstractNum w:abstractNumId="27" w15:restartNumberingAfterBreak="0">
+  <w:abstractNum w:abstractNumId="32" w15:restartNumberingAfterBreak="0">
     <w:nsid w:val="699D06DA"/>
     <w:multiLevelType w:val="hybridMultilevel"/>
     <w:tmpl w:val="358CC6DE"/>
@@ -3569,7 +5701,7 @@
       </w:pPr>
     </w:lvl>
   </w:abstractNum>
-  <w:abstractNum w:abstractNumId="28" w15:restartNumberingAfterBreak="0">
+  <w:abstractNum w:abstractNumId="33" w15:restartNumberingAfterBreak="0">
     <w:nsid w:val="6B376AD6"/>
     <w:multiLevelType w:val="hybridMultilevel"/>
     <w:tmpl w:val="286039B8"/>
@@ -3661,7 +5793,7 @@
       </w:pPr>
     </w:lvl>
   </w:abstractNum>
-  <w:abstractNum w:abstractNumId="29" w15:restartNumberingAfterBreak="0">
+  <w:abstractNum w:abstractNumId="34" w15:restartNumberingAfterBreak="0">
     <w:nsid w:val="71312A59"/>
     <w:multiLevelType w:val="hybridMultilevel"/>
     <w:tmpl w:val="A0929D8E"/>
@@ -3747,7 +5879,7 @@
       </w:pPr>
     </w:lvl>
   </w:abstractNum>
-  <w:abstractNum w:abstractNumId="30" w15:restartNumberingAfterBreak="0">
+  <w:abstractNum w:abstractNumId="35" w15:restartNumberingAfterBreak="0">
     <w:nsid w:val="73670B7E"/>
     <w:multiLevelType w:val="hybridMultilevel"/>
     <w:tmpl w:val="3A1E050A"/>
@@ -3860,7 +5992,7 @@
       </w:rPr>
     </w:lvl>
   </w:abstractNum>
-  <w:abstractNum w:abstractNumId="31" w15:restartNumberingAfterBreak="0">
+  <w:abstractNum w:abstractNumId="36" w15:restartNumberingAfterBreak="0">
     <w:nsid w:val="76417436"/>
     <w:multiLevelType w:val="hybridMultilevel"/>
     <w:tmpl w:val="D90C6236"/>
@@ -3949,7 +6081,7 @@
       </w:pPr>
     </w:lvl>
   </w:abstractNum>
-  <w:abstractNum w:abstractNumId="32" w15:restartNumberingAfterBreak="0">
+  <w:abstractNum w:abstractNumId="37" w15:restartNumberingAfterBreak="0">
     <w:nsid w:val="77AA0B70"/>
     <w:multiLevelType w:val="multilevel"/>
     <w:tmpl w:val="0419001F"/>
@@ -4035,7 +6167,7 @@
       </w:pPr>
     </w:lvl>
   </w:abstractNum>
-  <w:abstractNum w:abstractNumId="33" w15:restartNumberingAfterBreak="0">
+  <w:abstractNum w:abstractNumId="38" w15:restartNumberingAfterBreak="0">
     <w:nsid w:val="7EB527D0"/>
     <w:multiLevelType w:val="hybridMultilevel"/>
     <w:tmpl w:val="5ACA58B0"/>
@@ -4125,106 +6257,121 @@
     </w:lvl>
   </w:abstractNum>
   <w:num w:numId="1" w16cid:durableId="124080846">
+    <w:abstractNumId w:val="33"/>
+  </w:num>
+  <w:num w:numId="2" w16cid:durableId="1935934136">
+    <w:abstractNumId w:val="14"/>
+  </w:num>
+  <w:num w:numId="3" w16cid:durableId="1699047275">
+    <w:abstractNumId w:val="19"/>
+  </w:num>
+  <w:num w:numId="4" w16cid:durableId="781607056">
+    <w:abstractNumId w:val="23"/>
+  </w:num>
+  <w:num w:numId="5" w16cid:durableId="592251075">
+    <w:abstractNumId w:val="7"/>
+  </w:num>
+  <w:num w:numId="6" w16cid:durableId="8526383">
+    <w:abstractNumId w:val="26"/>
+  </w:num>
+  <w:num w:numId="7" w16cid:durableId="20938059">
+    <w:abstractNumId w:val="38"/>
+  </w:num>
+  <w:num w:numId="8" w16cid:durableId="1308164629">
     <w:abstractNumId w:val="28"/>
   </w:num>
-  <w:num w:numId="2" w16cid:durableId="1935934136">
+  <w:num w:numId="9" w16cid:durableId="1825657164">
+    <w:abstractNumId w:val="24"/>
+  </w:num>
+  <w:num w:numId="10" w16cid:durableId="1316102583">
+    <w:abstractNumId w:val="10"/>
+  </w:num>
+  <w:num w:numId="11" w16cid:durableId="1519393256">
+    <w:abstractNumId w:val="36"/>
+  </w:num>
+  <w:num w:numId="12" w16cid:durableId="2027636979">
+    <w:abstractNumId w:val="4"/>
+  </w:num>
+  <w:num w:numId="13" w16cid:durableId="544683702">
+    <w:abstractNumId w:val="3"/>
+  </w:num>
+  <w:num w:numId="14" w16cid:durableId="631787220">
+    <w:abstractNumId w:val="37"/>
+  </w:num>
+  <w:num w:numId="15" w16cid:durableId="1235972359">
+    <w:abstractNumId w:val="27"/>
+  </w:num>
+  <w:num w:numId="16" w16cid:durableId="1847288739">
     <w:abstractNumId w:val="12"/>
   </w:num>
-  <w:num w:numId="3" w16cid:durableId="1699047275">
-    <w:abstractNumId w:val="16"/>
+  <w:num w:numId="17" w16cid:durableId="1774126069">
+    <w:abstractNumId w:val="9"/>
   </w:num>
-  <w:num w:numId="4" w16cid:durableId="781607056">
-    <w:abstractNumId w:val="19"/>
-  </w:num>
-  <w:num w:numId="5" w16cid:durableId="592251075">
-    <w:abstractNumId w:val="5"/>
-  </w:num>
-  <w:num w:numId="6" w16cid:durableId="8526383">
-    <w:abstractNumId w:val="22"/>
-  </w:num>
-  <w:num w:numId="7" w16cid:durableId="20938059">
-    <w:abstractNumId w:val="33"/>
-  </w:num>
-  <w:num w:numId="8" w16cid:durableId="1308164629">
-    <w:abstractNumId w:val="24"/>
-  </w:num>
-  <w:num w:numId="9" w16cid:durableId="1825657164">
+  <w:num w:numId="18" w16cid:durableId="1270966782">
     <w:abstractNumId w:val="20"/>
   </w:num>
-  <w:num w:numId="10" w16cid:durableId="1316102583">
-    <w:abstractNumId w:val="8"/>
-  </w:num>
-  <w:num w:numId="11" w16cid:durableId="1519393256">
-    <w:abstractNumId w:val="31"/>
-  </w:num>
-  <w:num w:numId="12" w16cid:durableId="2027636979">
-    <w:abstractNumId w:val="3"/>
-  </w:num>
-  <w:num w:numId="13" w16cid:durableId="544683702">
-    <w:abstractNumId w:val="2"/>
-  </w:num>
-  <w:num w:numId="14" w16cid:durableId="631787220">
-    <w:abstractNumId w:val="32"/>
-  </w:num>
-  <w:num w:numId="15" w16cid:durableId="1235972359">
-    <w:abstractNumId w:val="23"/>
-  </w:num>
-  <w:num w:numId="16" w16cid:durableId="1847288739">
-    <w:abstractNumId w:val="10"/>
-  </w:num>
-  <w:num w:numId="17" w16cid:durableId="1774126069">
-    <w:abstractNumId w:val="7"/>
-  </w:num>
-  <w:num w:numId="18" w16cid:durableId="1270966782">
-    <w:abstractNumId w:val="17"/>
-  </w:num>
   <w:num w:numId="19" w16cid:durableId="1123034992">
-    <w:abstractNumId w:val="15"/>
+    <w:abstractNumId w:val="18"/>
   </w:num>
   <w:num w:numId="20" w16cid:durableId="2142533163">
     <w:abstractNumId w:val="0"/>
   </w:num>
   <w:num w:numId="21" w16cid:durableId="1478575517">
+    <w:abstractNumId w:val="13"/>
+  </w:num>
+  <w:num w:numId="22" w16cid:durableId="342634910">
+    <w:abstractNumId w:val="32"/>
+  </w:num>
+  <w:num w:numId="23" w16cid:durableId="558052145">
+    <w:abstractNumId w:val="29"/>
+  </w:num>
+  <w:num w:numId="24" w16cid:durableId="583221176">
+    <w:abstractNumId w:val="8"/>
+  </w:num>
+  <w:num w:numId="25" w16cid:durableId="1289971573">
+    <w:abstractNumId w:val="2"/>
+  </w:num>
+  <w:num w:numId="26" w16cid:durableId="330643291">
+    <w:abstractNumId w:val="16"/>
+  </w:num>
+  <w:num w:numId="27" w16cid:durableId="133646053">
+    <w:abstractNumId w:val="35"/>
+  </w:num>
+  <w:num w:numId="28" w16cid:durableId="2131044270">
+    <w:abstractNumId w:val="34"/>
+  </w:num>
+  <w:num w:numId="29" w16cid:durableId="356779711">
+    <w:abstractNumId w:val="5"/>
+  </w:num>
+  <w:num w:numId="30" w16cid:durableId="363599697">
     <w:abstractNumId w:val="11"/>
   </w:num>
-  <w:num w:numId="22" w16cid:durableId="342634910">
-    <w:abstractNumId w:val="27"/>
+  <w:num w:numId="31" w16cid:durableId="1912303875">
+    <w:abstractNumId w:val="21"/>
   </w:num>
-  <w:num w:numId="23" w16cid:durableId="558052145">
+  <w:num w:numId="32" w16cid:durableId="952324445">
+    <w:abstractNumId w:val="15"/>
+  </w:num>
+  <w:num w:numId="33" w16cid:durableId="777411014">
     <w:abstractNumId w:val="25"/>
   </w:num>
-  <w:num w:numId="24" w16cid:durableId="583221176">
+  <w:num w:numId="34" w16cid:durableId="1360474040">
+    <w:abstractNumId w:val="31"/>
+  </w:num>
+  <w:num w:numId="35" w16cid:durableId="1574778653">
+    <w:abstractNumId w:val="1"/>
+  </w:num>
+  <w:num w:numId="36" w16cid:durableId="1598976765">
     <w:abstractNumId w:val="6"/>
   </w:num>
-  <w:num w:numId="25" w16cid:durableId="1289971573">
-    <w:abstractNumId w:val="1"/>
+  <w:num w:numId="37" w16cid:durableId="196432852">
+    <w:abstractNumId w:val="22"/>
   </w:num>
-  <w:num w:numId="26" w16cid:durableId="330643291">
-    <w:abstractNumId w:val="14"/>
+  <w:num w:numId="38" w16cid:durableId="194083912">
+    <w:abstractNumId w:val="17"/>
   </w:num>
-  <w:num w:numId="27" w16cid:durableId="133646053">
+  <w:num w:numId="39" w16cid:durableId="2069919410">
     <w:abstractNumId w:val="30"/>
-  </w:num>
-  <w:num w:numId="28" w16cid:durableId="2131044270">
-    <w:abstractNumId w:val="29"/>
-  </w:num>
-  <w:num w:numId="29" w16cid:durableId="356779711">
-    <w:abstractNumId w:val="4"/>
-  </w:num>
-  <w:num w:numId="30" w16cid:durableId="363599697">
-    <w:abstractNumId w:val="9"/>
-  </w:num>
-  <w:num w:numId="31" w16cid:durableId="1912303875">
-    <w:abstractNumId w:val="18"/>
-  </w:num>
-  <w:num w:numId="32" w16cid:durableId="952324445">
-    <w:abstractNumId w:val="13"/>
-  </w:num>
-  <w:num w:numId="33" w16cid:durableId="777411014">
-    <w:abstractNumId w:val="21"/>
-  </w:num>
-  <w:num w:numId="34" w16cid:durableId="1360474040">
-    <w:abstractNumId w:val="26"/>
   </w:num>
 </w:numbering>
 </file>
@@ -4682,7 +6829,6 @@
   <w:style w:type="character" w:default="1" w:styleId="a0">
     <w:name w:val="Default Paragraph Font"/>
     <w:uiPriority w:val="1"/>
-    <w:semiHidden/>
     <w:unhideWhenUsed/>
   </w:style>
   <w:style w:type="table" w:default="1" w:styleId="a1">
@@ -4989,6 +7135,29 @@
       <w:szCs w:val="20"/>
     </w:rPr>
   </w:style>
+  <w:style w:type="character" w:styleId="af5">
+    <w:name w:val="Hyperlink"/>
+    <w:basedOn w:val="a0"/>
+    <w:uiPriority w:val="99"/>
+    <w:unhideWhenUsed/>
+    <w:rsid w:val="00837C1E"/>
+    <w:rPr>
+      <w:color w:val="0000FF" w:themeColor="hyperlink"/>
+      <w:u w:val="single"/>
+    </w:rPr>
+  </w:style>
+  <w:style w:type="character" w:styleId="af6">
+    <w:name w:val="Unresolved Mention"/>
+    <w:basedOn w:val="a0"/>
+    <w:uiPriority w:val="99"/>
+    <w:semiHidden/>
+    <w:unhideWhenUsed/>
+    <w:rsid w:val="00837C1E"/>
+    <w:rPr>
+      <w:color w:val="605E5C"/>
+      <w:shd w:val="clear" w:color="auto" w:fill="E1DFDD"/>
+    </w:rPr>
+  </w:style>
 </w:styles>
 </file>
 

</xml_diff>

<commit_message>
please give me stength
</commit_message>
<xml_diff>
--- a/7 семестр/ИСИС/ЛР 5/ИСИС ЛР 5.docx
+++ b/7 семестр/ИСИС/ЛР 5/ИСИС ЛР 5.docx
@@ -333,6 +333,9 @@
         <w:ind w:firstLine="0"/>
         <w:jc w:val="right"/>
       </w:pPr>
+      <w:r>
+        <w:t>Кротов К. В</w:t>
+      </w:r>
       <w:r>
         <w:t>.</w:t>
       </w:r>
@@ -463,11 +466,7 @@
         <w:t>ЦЕЛЬ РАБОТЫ</w:t>
       </w:r>
     </w:p>
-    <w:p>
-      <w:pPr>
-        <w:ind w:firstLine="0"/>
-      </w:pPr>
-    </w:p>
+    <w:p/>
     <w:p>
       <w:r>
         <w:t>Исследование особенностей использования основных сетевых серверных служб стека протоколов TCP/IP и конфигурации серверов, реализующих эти службы, приобрести практические навыки по конфигурации серверного сетевого оборудования</w:t>
@@ -490,13 +489,7 @@
         <w:t>ЗАДАНИЕ</w:t>
       </w:r>
     </w:p>
-    <w:p>
-      <w:pPr>
-        <w:spacing w:after="200" w:line="276" w:lineRule="auto"/>
-        <w:ind w:firstLine="0"/>
-        <w:jc w:val="center"/>
-      </w:pPr>
-    </w:p>
+    <w:p/>
     <w:p>
       <w:pPr>
         <w:pStyle w:val="aa"/>
@@ -634,7 +627,47 @@
         <w:ind w:hanging="578"/>
       </w:pPr>
       <w:r>
-        <w:t>Установить для всех серверов сети статический режим адресации и задать их адреса в следующем виде: XY.0.0.10 – DHCP-сервер; XY.0.0.100 – DNS-сервер; XY.0.0.100 – HTTP-сервер www.sevgu.ru; XY.0.0.200 – HTTP-сервер www.kaf.is</w:t>
+        <w:t xml:space="preserve">Установить для всех серверов сети статический режим адресации и задать их адреса в следующем виде: </w:t>
+      </w:r>
+      <w:r>
+        <w:rPr>
+          <w:i/>
+          <w:iCs/>
+        </w:rPr>
+        <w:t>1</w:t>
+      </w:r>
+      <w:r>
+        <w:t xml:space="preserve">.0.0.10 – DHCP-сервер; </w:t>
+      </w:r>
+      <w:r>
+        <w:rPr>
+          <w:i/>
+          <w:iCs/>
+        </w:rPr>
+        <w:t>1</w:t>
+      </w:r>
+      <w:r>
+        <w:t xml:space="preserve">.0.0.100 – DNS-сервер; </w:t>
+      </w:r>
+      <w:r>
+        <w:rPr>
+          <w:i/>
+          <w:iCs/>
+        </w:rPr>
+        <w:t>1</w:t>
+      </w:r>
+      <w:r>
+        <w:t xml:space="preserve">.0.0.100 – HTTP-сервер www.sevgu.ru; </w:t>
+      </w:r>
+      <w:r>
+        <w:rPr>
+          <w:i/>
+          <w:iCs/>
+        </w:rPr>
+        <w:t>1</w:t>
+      </w:r>
+      <w:r>
+        <w:t>.0.0.200 – HTTP-сервер www.kaf.is</w:t>
       </w:r>
       <w:r>
         <w:t>;</w:t>
@@ -651,7 +684,17 @@
       </w:pPr>
       <w:r>
         <w:lastRenderedPageBreak/>
-        <w:t>Задать режим динамической адресации для оконечных устройств сети и провести установку и настройку DHCP-сервера на компьютере XY.0.0.10;</w:t>
+        <w:t xml:space="preserve">Задать режим динамической адресации для оконечных устройств сети и провести установку и настройку DHCP-сервера на компьютере </w:t>
+      </w:r>
+      <w:r>
+        <w:rPr>
+          <w:i/>
+          <w:iCs/>
+        </w:rPr>
+        <w:t>1</w:t>
+      </w:r>
+      <w:r>
+        <w:t>.0.0.10;</w:t>
       </w:r>
     </w:p>
     <w:p>
@@ -664,7 +707,17 @@
         <w:ind w:hanging="578"/>
       </w:pPr>
       <w:r>
-        <w:t>Установить на серверный компьютер XY.0.0.100 DNS-сервер и осуществить его настройку;</w:t>
+        <w:t xml:space="preserve">Установить на серверный компьютер </w:t>
+      </w:r>
+      <w:r>
+        <w:rPr>
+          <w:i/>
+          <w:iCs/>
+        </w:rPr>
+        <w:t>1</w:t>
+      </w:r>
+      <w:r>
+        <w:t>.0.0.100 DNS-сервер и осуществить его настройку;</w:t>
       </w:r>
     </w:p>
     <w:p>
@@ -677,7 +730,17 @@
         <w:ind w:hanging="578"/>
       </w:pPr>
       <w:r>
-        <w:t>Установить на серверный компьютер XY.0.0.100 HTTP-сервер и разместить на н</w:t>
+        <w:t xml:space="preserve">Установить на серверный компьютер </w:t>
+      </w:r>
+      <w:r>
+        <w:rPr>
+          <w:i/>
+          <w:iCs/>
+        </w:rPr>
+        <w:t>1</w:t>
+      </w:r>
+      <w:r>
+        <w:t>.0.0.100 HTTP-сервер и разместить на н</w:t>
       </w:r>
       <w:r>
         <w:t>ё</w:t>
@@ -699,7 +762,17 @@
         <w:ind w:hanging="578"/>
       </w:pPr>
       <w:r>
-        <w:t>Установить на серверный компьютер XY.0.0.200 HTTP-сервер, и разместить на н</w:t>
+        <w:t xml:space="preserve">Установить на серверный компьютер </w:t>
+      </w:r>
+      <w:r>
+        <w:rPr>
+          <w:i/>
+          <w:iCs/>
+        </w:rPr>
+        <w:t>1</w:t>
+      </w:r>
+      <w:r>
+        <w:t>.0.0.200 HTTP-сервер, и разместить на н</w:t>
       </w:r>
       <w:r>
         <w:t>ё</w:t>
@@ -756,7 +829,6 @@
     </w:p>
     <w:p>
       <w:pPr>
-        <w:ind w:firstLine="0"/>
         <w:rPr>
           <w:lang w:val="en-US"/>
         </w:rPr>
@@ -801,22 +873,11 @@
       </w:r>
     </w:p>
     <w:p>
-      <w:pPr>
-        <w:rPr>
-          <w:lang w:val="en-US"/>
-        </w:rPr>
-      </w:pPr>
       <w:r>
         <w:t>Центральный коммутатор объединяет группы устройств: серверы (DNS, DHCP, HTTP), компьютеры, ноутбуки, принтер. Есть как физические связи, так и точка беспроводного доступа. Интернет доступен через кабельный модем, подключённый к облаку.</w:t>
       </w:r>
     </w:p>
-    <w:p>
-      <w:pPr>
-        <w:rPr>
-          <w:lang w:val="en-US"/>
-        </w:rPr>
-      </w:pPr>
-    </w:p>
+    <w:p/>
     <w:p>
       <w:pPr>
         <w:ind w:firstLine="0"/>
@@ -875,7 +936,9 @@
     </w:p>
     <w:p>
       <w:pPr>
-        <w:ind w:firstLine="0"/>
+        <w:rPr>
+          <w:lang w:val="en-US"/>
+        </w:rPr>
       </w:pPr>
     </w:p>
     <w:p>
@@ -883,10 +946,7 @@
         <w:t xml:space="preserve">Сначала </w:t>
       </w:r>
       <w:r>
-        <w:t xml:space="preserve">для </w:t>
-      </w:r>
-      <w:r>
-        <w:t>серверов сети была задана статическая адресация:</w:t>
+        <w:t>для серверов сети была задана статическая адресация:</w:t>
       </w:r>
     </w:p>
     <w:p>
@@ -910,13 +970,7 @@
         <w:rPr>
           <w:lang w:val="en-US"/>
         </w:rPr>
-        <w:t xml:space="preserve"> / </w:t>
-      </w:r>
-      <w:r>
-        <w:rPr>
-          <w:lang w:val="en-US"/>
-        </w:rPr>
-        <w:t>HTTP (www.sevgu.ru)</w:t>
+        <w:t xml:space="preserve"> / HTTP (www.sevgu.ru)</w:t>
       </w:r>
       <w:r>
         <w:rPr>
@@ -949,10 +1003,7 @@
         <w:t>HTTP (www.kaf.is):</w:t>
       </w:r>
       <w:r>
-        <w:t xml:space="preserve"> </w:t>
-      </w:r>
-      <w:r>
-        <w:t>1.0.0.</w:t>
+        <w:t xml:space="preserve"> 1.0.0.</w:t>
       </w:r>
       <w:r>
         <w:t>2</w:t>
@@ -963,10 +1014,7 @@
     </w:p>
     <w:p>
       <w:r>
-        <w:t>Чтобы пакеты могли передаваться через облако</w:t>
-      </w:r>
-      <w:r>
-        <w:t xml:space="preserve"> </w:t>
+        <w:t xml:space="preserve">Чтобы пакеты могли передаваться через облако </w:t>
       </w:r>
       <w:r>
         <w:t xml:space="preserve">на модеме </w:t>
@@ -1055,11 +1103,7 @@
         <w:t>2 – Связь ЛКС с облаком через модем</w:t>
       </w:r>
     </w:p>
-    <w:p>
-      <w:pPr>
-        <w:ind w:firstLine="0"/>
-      </w:pPr>
-    </w:p>
+    <w:p/>
     <w:p>
       <w:r>
         <w:t xml:space="preserve">Далее был выделен сервер для протокола </w:t>
@@ -1133,11 +1177,7 @@
         <w:t>.</w:t>
       </w:r>
     </w:p>
-    <w:p>
-      <w:pPr>
-        <w:ind w:firstLine="0"/>
-      </w:pPr>
-    </w:p>
+    <w:p/>
     <w:p>
       <w:pPr>
         <w:ind w:firstLine="0"/>
@@ -1206,11 +1246,7 @@
         <w:t>Конфигурация DHCP-сервера</w:t>
       </w:r>
     </w:p>
-    <w:p>
-      <w:pPr>
-        <w:ind w:firstLine="0"/>
-      </w:pPr>
-    </w:p>
+    <w:p/>
     <w:p>
       <w:r>
         <w:t xml:space="preserve">На другом сервере была установлена и настроена служба </w:t>
@@ -1311,7 +1347,13 @@
     <w:p/>
     <w:p>
       <w:r>
-        <w:t xml:space="preserve">На серверах с соответствующими </w:t>
+        <w:t>На серверах с</w:t>
+      </w:r>
+      <w:r>
+        <w:t xml:space="preserve"> </w:t>
+      </w:r>
+      <w:r>
+        <w:t xml:space="preserve">соответствующими </w:t>
       </w:r>
       <w:r>
         <w:rPr>
@@ -1381,6 +1423,7 @@
       <w:r>
         <w:t xml:space="preserve">и </w:t>
       </w:r>
+      <w:proofErr w:type="spellStart"/>
       <w:r>
         <w:rPr>
           <w:i/>
@@ -1389,6 +1432,7 @@
         </w:rPr>
         <w:t>sevsu</w:t>
       </w:r>
+      <w:proofErr w:type="spellEnd"/>
       <w:r>
         <w:rPr>
           <w:i/>
@@ -1396,6 +1440,7 @@
         </w:rPr>
         <w:t>.</w:t>
       </w:r>
+      <w:proofErr w:type="spellStart"/>
       <w:r>
         <w:rPr>
           <w:i/>
@@ -1404,6 +1449,7 @@
         </w:rPr>
         <w:t>ru</w:t>
       </w:r>
+      <w:proofErr w:type="spellEnd"/>
       <w:r>
         <w:t xml:space="preserve">. </w:t>
       </w:r>
@@ -1450,13 +1496,7 @@
         <w:t>).</w:t>
       </w:r>
     </w:p>
-    <w:p>
-      <w:pPr>
-        <w:rPr>
-          <w:lang w:val="en-US"/>
-        </w:rPr>
-      </w:pPr>
-    </w:p>
+    <w:p/>
     <w:p>
       <w:pPr>
         <w:ind w:firstLine="0"/>
@@ -1524,34 +1564,36 @@
       <w:r>
         <w:t xml:space="preserve"> для </w:t>
       </w:r>
+      <w:proofErr w:type="spellStart"/>
       <w:r>
         <w:rPr>
           <w:lang w:val="en-US"/>
         </w:rPr>
         <w:t>sevsu</w:t>
       </w:r>
+      <w:proofErr w:type="spellEnd"/>
       <w:r>
         <w:t>.</w:t>
       </w:r>
+      <w:proofErr w:type="spellStart"/>
       <w:r>
         <w:rPr>
           <w:lang w:val="en-US"/>
         </w:rPr>
         <w:t>ru</w:t>
       </w:r>
-    </w:p>
+      <w:proofErr w:type="spellEnd"/>
+    </w:p>
+    <w:p/>
     <w:p>
       <w:pPr>
         <w:ind w:firstLine="0"/>
         <w:jc w:val="center"/>
       </w:pPr>
-    </w:p>
-    <w:p>
-      <w:pPr>
-        <w:ind w:firstLine="0"/>
-        <w:jc w:val="center"/>
-      </w:pPr>
-      <w:r>
+      <w:r>
+        <w:rPr>
+          <w:noProof/>
+        </w:rPr>
         <w:drawing>
           <wp:inline distT="0" distB="0" distL="0" distR="0" wp14:anchorId="2EC49459" wp14:editId="2512EE6D">
             <wp:extent cx="5092700" cy="2016342"/>
@@ -1595,21 +1637,15 @@
         <w:jc w:val="center"/>
       </w:pPr>
       <w:r>
-        <w:t>Рисунок 3.</w:t>
-      </w:r>
-      <w:r>
-        <w:t>6</w:t>
+        <w:t xml:space="preserve">Рисунок 3.6 </w:t>
+      </w:r>
+      <w:r>
+        <w:sym w:font="Symbol" w:char="F02D"/>
       </w:r>
       <w:r>
         <w:t xml:space="preserve"> </w:t>
       </w:r>
       <w:r>
-        <w:sym w:font="Symbol" w:char="F02D"/>
-      </w:r>
-      <w:r>
-        <w:t xml:space="preserve"> </w:t>
-      </w:r>
-      <w:r>
         <w:t>Конфигурация HTTP-сервера</w:t>
       </w:r>
       <w:r>
@@ -1631,12 +1667,7 @@
         <w:t>is</w:t>
       </w:r>
     </w:p>
-    <w:p>
-      <w:pPr>
-        <w:ind w:firstLine="0"/>
-        <w:jc w:val="center"/>
-      </w:pPr>
-    </w:p>
+    <w:p/>
     <w:p>
       <w:r>
         <w:t>После всех настроек была проверена функциональность полученной сети. Во</w:t>
@@ -1747,7 +1778,7 @@
         <w:t>8</w:t>
       </w:r>
       <w:r>
-        <w:t xml:space="preserve">). </w:t>
+        <w:t>).</w:t>
       </w:r>
     </w:p>
     <w:p/>
@@ -1757,6 +1788,9 @@
         <w:jc w:val="center"/>
       </w:pPr>
       <w:r>
+        <w:rPr>
+          <w:noProof/>
+        </w:rPr>
         <w:drawing>
           <wp:inline distT="0" distB="0" distL="0" distR="0" wp14:anchorId="6388C540" wp14:editId="79D82B38">
             <wp:extent cx="3547229" cy="1619250"/>
@@ -1830,45 +1864,43 @@
         <w:t>1</w:t>
       </w:r>
     </w:p>
+    <w:p/>
+    <w:p>
+      <w:r>
+        <w:t>Помимо этого</w:t>
+      </w:r>
+      <w:r>
+        <w:t>,</w:t>
+      </w:r>
+      <w:r>
+        <w:t xml:space="preserve"> </w:t>
+      </w:r>
+      <w:r>
+        <w:t>был выполнен пинг на имя сервера. Оба настроенн</w:t>
+      </w:r>
+      <w:r>
+        <w:t xml:space="preserve">ых сервера </w:t>
+      </w:r>
+      <w:r>
+        <w:t>успешно ответили на запрос (рисунок 3.</w:t>
+      </w:r>
+      <w:r>
+        <w:t>9</w:t>
+      </w:r>
+      <w:r>
+        <w:t>).</w:t>
+      </w:r>
+    </w:p>
+    <w:p/>
     <w:p>
       <w:pPr>
         <w:ind w:firstLine="0"/>
         <w:jc w:val="center"/>
       </w:pPr>
-    </w:p>
-    <w:p>
-      <w:r>
-        <w:t>Помимо этого</w:t>
-      </w:r>
-      <w:r>
-        <w:t>,</w:t>
-      </w:r>
-      <w:r>
-        <w:t xml:space="preserve"> </w:t>
-      </w:r>
-      <w:r>
-        <w:t>был выполнен пинг на имя сервера. Оба настроенн</w:t>
-      </w:r>
-      <w:r>
-        <w:t xml:space="preserve">ых сервера </w:t>
-      </w:r>
-      <w:r>
-        <w:t>успешно ответили на запрос (рисунок 3.</w:t>
-      </w:r>
-      <w:r>
-        <w:t>9</w:t>
-      </w:r>
-      <w:r>
-        <w:t>).</w:t>
-      </w:r>
-    </w:p>
-    <w:p/>
-    <w:p>
-      <w:pPr>
-        <w:ind w:firstLine="0"/>
-        <w:jc w:val="center"/>
-      </w:pPr>
-      <w:r>
+      <w:r>
+        <w:rPr>
+          <w:noProof/>
+        </w:rPr>
         <w:drawing>
           <wp:inline distT="0" distB="0" distL="0" distR="0" wp14:anchorId="0C454B13" wp14:editId="5AB88794">
             <wp:extent cx="3594100" cy="3302000"/>
@@ -1999,13 +2031,7 @@
         <w:t>).</w:t>
       </w:r>
     </w:p>
-    <w:p>
-      <w:pPr>
-        <w:rPr>
-          <w:lang w:val="en-US"/>
-        </w:rPr>
-      </w:pPr>
-    </w:p>
+    <w:p/>
     <w:p>
       <w:pPr>
         <w:ind w:firstLine="0"/>
@@ -2015,6 +2041,9 @@
         </w:rPr>
       </w:pPr>
       <w:r>
+        <w:rPr>
+          <w:noProof/>
+        </w:rPr>
         <w:lastRenderedPageBreak/>
         <w:drawing>
           <wp:inline distT="0" distB="0" distL="0" distR="0" wp14:anchorId="733785B6" wp14:editId="551EB419">
@@ -2067,21 +2096,25 @@
       <w:r>
         <w:t xml:space="preserve">– Проверка доступа к сайту </w:t>
       </w:r>
+      <w:proofErr w:type="spellStart"/>
       <w:r>
         <w:rPr>
           <w:lang w:val="en-US"/>
         </w:rPr>
         <w:t>sevsu</w:t>
       </w:r>
+      <w:proofErr w:type="spellEnd"/>
       <w:r>
         <w:t>.</w:t>
       </w:r>
+      <w:proofErr w:type="spellStart"/>
       <w:r>
         <w:rPr>
           <w:lang w:val="en-US"/>
         </w:rPr>
         <w:t>ru</w:t>
       </w:r>
+      <w:proofErr w:type="spellEnd"/>
     </w:p>
     <w:p/>
     <w:p>
@@ -2093,6 +2126,9 @@
         </w:rPr>
       </w:pPr>
       <w:r>
+        <w:rPr>
+          <w:noProof/>
+        </w:rPr>
         <w:drawing>
           <wp:inline distT="0" distB="0" distL="0" distR="0" wp14:anchorId="0C4E1B5F" wp14:editId="1EFE5722">
             <wp:extent cx="5575300" cy="1671859"/>
@@ -2139,10 +2175,7 @@
         <w:t>Рисунок 3.1</w:t>
       </w:r>
       <w:r>
-        <w:t>1</w:t>
-      </w:r>
-      <w:r>
-        <w:t xml:space="preserve"> </w:t>
+        <w:t xml:space="preserve">1 </w:t>
       </w:r>
       <w:r>
         <w:t xml:space="preserve">– Проверка доступа к сайту </w:t>
@@ -2163,15 +2196,7 @@
         <w:t>is</w:t>
       </w:r>
     </w:p>
-    <w:p>
-      <w:pPr>
-        <w:ind w:firstLine="0"/>
-        <w:jc w:val="center"/>
-        <w:rPr>
-          <w:lang w:val="en-US"/>
-        </w:rPr>
-      </w:pPr>
-    </w:p>
+    <w:p/>
     <w:p>
       <w:r>
         <w:t>При проверке пингования по имени сервера в режиме симуляции и анализе заголовков кадров и пакетов был выявлен следующий порядок действий:</w:t>
@@ -2186,19 +2211,7 @@
         </w:numPr>
       </w:pPr>
       <w:r>
-        <w:t>PC</w:t>
-      </w:r>
-      <w:r>
-        <w:t xml:space="preserve"> получает через</w:t>
-      </w:r>
-      <w:r>
-        <w:t xml:space="preserve"> DNS-</w:t>
-      </w:r>
-      <w:r>
-        <w:t>сервер</w:t>
-      </w:r>
-      <w:r>
-        <w:t xml:space="preserve"> </w:t>
+        <w:t xml:space="preserve">PC получает через DNS-сервер </w:t>
       </w:r>
       <w:r>
         <w:rPr>
@@ -2210,16 +2223,7 @@
         <w:t>-</w:t>
       </w:r>
       <w:r>
-        <w:t>адрес по указанному</w:t>
-      </w:r>
-      <w:r>
-        <w:t xml:space="preserve"> доменно</w:t>
-      </w:r>
-      <w:r>
-        <w:t xml:space="preserve">му </w:t>
-      </w:r>
-      <w:r>
-        <w:t>имени</w:t>
+        <w:t>адрес по указанному доменному имени</w:t>
       </w:r>
       <w:r>
         <w:t>;</w:t>
@@ -2255,15 +2259,12 @@
         <w:t>ping</w:t>
       </w:r>
       <w:r>
+        <w:t xml:space="preserve"> на</w:t>
+      </w:r>
+      <w:r>
         <w:t xml:space="preserve"> </w:t>
       </w:r>
       <w:r>
-        <w:t>на</w:t>
-      </w:r>
-      <w:r>
-        <w:t xml:space="preserve"> </w:t>
-      </w:r>
-      <w:r>
         <w:t xml:space="preserve">этот </w:t>
       </w:r>
       <w:r>
@@ -2276,29 +2277,14 @@
         <w:t>-</w:t>
       </w:r>
       <w:r>
-        <w:t>адрес</w:t>
-      </w:r>
-      <w:r>
-        <w:t xml:space="preserve"> и через промежуточные устройства обменивается с ними пакетами</w:t>
+        <w:t>адрес и через промежуточные устройства обменивается с ними пакетами</w:t>
       </w:r>
       <w:r>
         <w:t>;</w:t>
       </w:r>
     </w:p>
-    <w:p>
-      <w:pPr>
-        <w:rPr>
-          <w:lang w:val="en-US"/>
-        </w:rPr>
-      </w:pPr>
-    </w:p>
-    <w:p>
-      <w:pPr>
-        <w:rPr>
-          <w:lang w:val="en-US"/>
-        </w:rPr>
-      </w:pPr>
-    </w:p>
+    <w:p/>
+    <w:p/>
     <w:p>
       <w:pPr>
         <w:pStyle w:val="1"/>

</xml_diff>